<commit_message>
Regenerate Word exports from the trimmed chapters
Co-Authored-By: Claude Fable 5 <noreply@anthropic.com>
Claude-Session: https://claude.ai/code/session_01Ujtd6s8yXmH4U3woU8VqbA
</commit_message>
<xml_diff>
--- a/docx/ch02_virtue_ethics.docx
+++ b/docx/ch02_virtue_ethics.docx
@@ -209,7 +209,7 @@
         <w:pStyle w:val="FirstParagraph"/>
       </w:pPr>
       <w:r>
-        <w:t xml:space="preserve">Most ethical debates about technology focus on actions: Should platforms remove harmful content? Is it wrong to share someone's private information? Should companies be allowed to collect data on children? These are important questions, but they share an implicit framing — they treat ethics as a problem of sorting permitted actions from prohibited ones. A different tradition in moral philosophy asks a more fundamental question: not "What should I do?" but "What kind of person am I becoming?"</w:t>
+        <w:t xml:space="preserve">Most ethical debates about technology focus on actions: Should platforms remove harmful content? Should companies collect data on children? Both share a framing — ethics as sorting permitted actions from prohibited ones. A different tradition asks something more fundamental: not "What should I do?" but "What kind of person am I becoming?"</w:t>
       </w:r>
     </w:p>
     <w:p>
@@ -230,7 +230,7 @@
         <w:t xml:space="preserve">virtue ethics</w:t>
       </w:r>
       <w:r>
-        <w:t xml:space="preserve">, the oldest sustained tradition in Western moral philosophy, rooted in the work of the ancient Greek philosopher Aristotle. Rather than providing a decision procedure for evaluating individual acts, virtue ethics invites us to think about</w:t>
+        <w:t xml:space="preserve">, the oldest sustained tradition in Western moral philosophy, rooted in Aristotle. Rather than a decision procedure for individual acts, it asks about</w:t>
       </w:r>
       <w:r>
         <w:t xml:space="preserve"> </w:t>
@@ -246,7 +246,7 @@
         <w:t xml:space="preserve"> </w:t>
       </w:r>
       <w:r>
-        <w:t xml:space="preserve">— the stable dispositions to perceive, feel, and act in certain ways that define who we are over time. From this perspective, technology is a moral issue not primarily because specific apps or algorithms occasionally produce bad outcomes, but because the daily practices of digital life are continuously shaping the people we are becoming.</w:t>
+        <w:t xml:space="preserve">— the stable dispositions to perceive, feel, and act that define who we are over time. Technology is then a moral issue because the daily practices of digital life shape the people we are becoming.</w:t>
       </w:r>
     </w:p>
     <w:p>
@@ -254,7 +254,7 @@
         <w:pStyle w:val="BodyText"/>
       </w:pPr>
       <w:r>
-        <w:t xml:space="preserve">In Chapter 1, we traced five major information revolutions and noticed a recurring pattern: each new technology reshapes not just what people can do, but how they think, communicate, and relate to each other. Writing atrophied the ancient practice of oral memory. The printing press disrupted religious authority and enabled mass propaganda. Mass media created the preconditions for totalitarianism. Virtue ethics gives us a precise vocabulary for naming what is at stake in these transformations: our intellectual and moral character. If Aristotle is right that character is formed by what we repeatedly do, then the habits built by hours of daily screen time are not ethically neutral.</w:t>
+        <w:t xml:space="preserve">Chapter 1 traced a recurring pattern: each technology reshapes not just what people can do but how they think and relate. Writing atrophied oral memory; print enabled mass propaganda; mass media created the preconditions for totalitarianism. Virtue ethics names what is at stake: our intellectual and moral character. If character is formed by what we repeatedly do, the habits built by hours of daily screen time are not ethically neutral.</w:t>
       </w:r>
     </w:p>
     <w:p>
@@ -262,7 +262,7 @@
         <w:pStyle w:val="BodyText"/>
       </w:pPr>
       <w:r>
-        <w:t xml:space="preserve">This chapter develops three interconnected arguments. First, we examine how social media and AI may undermine</w:t>
+        <w:t xml:space="preserve">This chapter develops three arguments — that social media and AI may undermine</w:t>
       </w:r>
       <w:r>
         <w:t xml:space="preserve"> </w:t>
@@ -275,10 +275,7 @@
         <w:t xml:space="preserve">intellectual virtues</w:t>
       </w:r>
       <w:r>
-        <w:t xml:space="preserve"> </w:t>
-      </w:r>
-      <w:r>
-        <w:t xml:space="preserve">— the habits of careful reasoning, sustained attention, and open-minded inquiry that make us good thinkers. Second, we look at how digital environments may erode</w:t>
+        <w:t xml:space="preserve">, erode</w:t>
       </w:r>
       <w:r>
         <w:t xml:space="preserve"> </w:t>
@@ -291,10 +288,7 @@
         <w:t xml:space="preserve">moral virtues</w:t>
       </w:r>
       <w:r>
-        <w:t xml:space="preserve"> </w:t>
-      </w:r>
-      <w:r>
-        <w:t xml:space="preserve">— the empathy, patience, civility, and honesty that make us good people to one another. Third, we consider whether these effects cumulatively threaten</w:t>
+        <w:t xml:space="preserve">, and cumulatively threaten</w:t>
       </w:r>
       <w:r>
         <w:t xml:space="preserve"> </w:t>
@@ -310,7 +304,7 @@
         <w:t xml:space="preserve"> </w:t>
       </w:r>
       <w:r>
-        <w:t xml:space="preserve">— the Aristotelian conception of a genuinely flourishing human life. We then survey policy responses and engage seriously with the strongest objections.</w:t>
+        <w:t xml:space="preserve">— then surveys policy responses and the strongest objections.</w:t>
       </w:r>
     </w:p>
     <w:p>
@@ -350,7 +344,7 @@
         <w:pStyle w:val="BodyText"/>
       </w:pPr>
       <w:r>
-        <w:t xml:space="preserve">That sentence is one of the most quoted lines in popular philosophy, and it is almost always credited to Aristotle. It is not his. The words are Will Durant's</w:t>
+        <w:t xml:space="preserve">That sentence is almost always credited to Aristotle. It is not his. The words are Will Durant's</w:t>
       </w:r>
       <w:r>
         <w:t xml:space="preserve"> </w:t>
@@ -359,7 +353,7 @@
         <w:t xml:space="preserve">(Durant, 1926)</w:t>
       </w:r>
       <w:r>
-        <w:t xml:space="preserve">, written in 1926 as a compressed summary of Aristotle's discussion of habituation in Book II of the</w:t>
+        <w:t xml:space="preserve">, written in 1926 to summarize Aristotle on habituation in Book II of the</w:t>
       </w:r>
       <w:r>
         <w:t xml:space="preserve"> </w:t>
@@ -378,7 +372,7 @@
         <w:t xml:space="preserve">(Aristotle, 2009)</w:t>
       </w:r>
       <w:r>
-        <w:t xml:space="preserve">. Over the following century the quotation marks quietly migrated from the summarizer to the philosopher being summarized. The error is worth pausing over, because a book about how information technologies shape our thinking should begin by noticing how a claim acquires authority simply by circulating. A vivid paraphrase attached to a famous name travels further than an accurate citation, and every repetition makes the attribution look better established than it is. Durant's line does capture Aristotle's position faithfully, which is precisely why it spread. But the difference between "Aristotle wrote this" and "someone once summarized Aristotle this way" is exactly the kind of distinction the intellectual virtues discussed in this chapter are meant to protect.</w:t>
+        <w:t xml:space="preserve">. Over the following century the quotation marks quietly migrated from the summarizer to the philosopher summarized. A vivid paraphrase attached to a famous name travels further than an accurate citation, and every repetition makes the attribution look better established. Durant captures Aristotle faithfully, which is why it spread — but the difference between "Aristotle wrote this" and "someone summarized Aristotle this way" is the distinction this chapter's intellectual virtues protect.</w:t>
       </w:r>
     </w:p>
     <w:p>
@@ -398,7 +392,7 @@
         <w:pStyle w:val="Compact"/>
       </w:pPr>
       <w:r>
-        <w:t xml:space="preserve">How would your answer to "What should I do?" differ from your answer to "What kind of person am I becoming?" when you decide how to spend the next hour?</w:t>
+        <w:t xml:space="preserve">Deciding how to spend the next hour, how would your answer to "What should I do?" differ from "What kind of person am I becoming?"</w:t>
       </w:r>
     </w:p>
     <w:p>
@@ -410,7 +404,7 @@
         <w:pStyle w:val="Compact"/>
       </w:pPr>
       <w:r>
-        <w:t xml:space="preserve">Before reading this section, had you seen the "we are what we repeatedly do" line attributed to Aristotle? What would it take for you to check an attribution before repeating it?</w:t>
+        <w:t xml:space="preserve">Had you seen the "we are what we repeatedly do" line attributed to Aristotle? What would it take for you to check an attribution before repeating it?</w:t>
       </w:r>
     </w:p>
     <w:p>
@@ -422,7 +416,7 @@
         <w:pStyle w:val="Compact"/>
       </w:pPr>
       <w:r>
-        <w:t xml:space="preserve">Chapter 1 argued that every information revolution changes how people think. Which of your own habits of thought do you think were formed by a technology rather than chosen by you?</w:t>
+        <w:t xml:space="preserve">Which of your own habits of thought were formed by a technology rather than chosen by you?</w:t>
       </w:r>
     </w:p>
     <w:bookmarkEnd w:id="23"/>
@@ -506,7 +500,7 @@
         <w:pStyle w:val="KeyThinker"/>
       </w:pPr>
       <w:r>
-        <w:t xml:space="preserve">Born in Stagira in northern Greece, Aristotle studied at Plato's Academy for twenty years before founding his own school, the</w:t>
+        <w:t xml:space="preserve">Born in Stagira, Aristotle studied at Plato's Academy for twenty years before founding the</w:t>
       </w:r>
       <w:r>
         <w:t xml:space="preserve"> </w:t>
@@ -519,7 +513,10 @@
         <w:t xml:space="preserve">Lyceum</w:t>
       </w:r>
       <w:r>
-        <w:t xml:space="preserve">, in Athens. He tutored the young Alexander the Great and was later simply known to medieval scholars as "the Philosopher" — no further identification needed. His</w:t>
+        <w:t xml:space="preserve"> </w:t>
+      </w:r>
+      <w:r>
+        <w:t xml:space="preserve">in Athens. He tutored the young Alexander the Great and was known to medieval scholars simply as "the Philosopher." His</w:t>
       </w:r>
       <w:r>
         <w:t xml:space="preserve"> </w:t>
@@ -532,7 +529,7 @@
         <w:t xml:space="preserve">Nicomachean Ethics</w:t>
       </w:r>
       <w:r>
-        <w:t xml:space="preserve">, named for his son Nicomachus, remains one of the most carefully argued and widely read works of moral philosophy ever written. Unlike his teacher Plato, who grounded ethics in abstract ideal Forms, Aristotle began with the observable world: How do virtuous people actually live? What practices make a life go well?</w:t>
+        <w:t xml:space="preserve">, named for his son Nicomachus, remains one of the most carefully argued works of moral philosophy ever written. Unlike Plato, who grounded ethics in ideal Forms, Aristotle began with the observable world.</w:t>
       </w:r>
     </w:p>
     <w:bookmarkEnd w:id="28"/>
@@ -557,7 +554,7 @@
         <w:t xml:space="preserve"> </w:t>
       </w:r>
       <w:r>
-        <w:t xml:space="preserve">with what seems like a simple observation: every action aims at some good. We eat to satisfy hunger; we study to acquire knowledge; we work to earn money. But Aristotle asks: is there some</w:t>
+        <w:t xml:space="preserve">with a simple observation: every action aims at some good. We eat to satisfy hunger, study to acquire knowledge, work to earn money. But is there a</w:t>
       </w:r>
       <w:r>
         <w:t xml:space="preserve"> </w:t>
@@ -573,7 +570,7 @@
         <w:t xml:space="preserve"> </w:t>
       </w:r>
       <w:r>
-        <w:t xml:space="preserve">good — something we pursue for its own sake rather than as a means to something else? He argues that the answer is</w:t>
+        <w:t xml:space="preserve">good, pursued for its own sake alone? He argues that the answer is</w:t>
       </w:r>
       <w:r>
         <w:t xml:space="preserve"> </w:t>
@@ -586,7 +583,7 @@
         <w:t xml:space="preserve">eudaimonia</w:t>
       </w:r>
       <w:r>
-        <w:t xml:space="preserve">, a Greek word usually translated as "happiness" or "flourishing," but meaning something richer than either English word typically conveys.</w:t>
+        <w:t xml:space="preserve">, usually translated "happiness" or "flourishing," but richer than either word conveys.</w:t>
       </w:r>
     </w:p>
     <w:p>
@@ -610,20 +607,7 @@
         <w:pStyle w:val="BodyText"/>
       </w:pPr>
       <w:r>
-        <w:t xml:space="preserve">Eudaimonia is not a feeling. It is not the pleasant emotional state you might experience on a good day, nor is it the life satisfaction you might report when surveyed. Eudaimonia, for Aristotle, is the</w:t>
-      </w:r>
-      <w:r>
-        <w:t xml:space="preserve"> </w:t>
-      </w:r>
-      <w:r>
-        <w:rPr>
-          <w:iCs/>
-          <w:i/>
-        </w:rPr>
-        <w:t xml:space="preserve">activity of the soul in accordance with virtue over a complete life</w:t>
-      </w:r>
-      <w:r>
-        <w:t xml:space="preserve">. It is what your life amounts to when you have developed and exercised your distinctively human capacities — above all, the capacity for reason — in an excellent way. A person can feel pleasure while doing something vicious; a person living in eudaimonia is, by definition, living well and acting rightly.</w:t>
+        <w:t xml:space="preserve">Eudaimonia is neither the pleasant emotional state of a good day nor the life satisfaction you report when surveyed. It is what your life amounts to when you have exercised your distinctively human capacities — above all, reason — excellently. One can feel pleasure while doing something vicious; a person living in eudaimonia is, by definition, living well.</w:t>
       </w:r>
     </w:p>
     <w:p>
@@ -919,7 +903,7 @@
         <w:pStyle w:val="BodyText"/>
       </w:pPr>
       <w:r>
-        <w:t xml:space="preserve">The row that does the most work here is the last one. Hedonic happiness and life satisfaction are both reports about how a life seems from the inside, and both can be mistaken; eudaimonia is a claim about how the life is actually going. This distinction matters enormously for evaluating technology. Social media platforms are very good at producing momentary pleasure — the dopamine hit of a notification, the satisfaction of a viral post, the comfort of an algorithmically curated feed. But whether these pleasurable experiences contribute to, or actually undermine, genuine flourishing is an entirely separate question.</w:t>
+        <w:t xml:space="preserve">The last row does the most work. Hedonic happiness and life satisfaction report how a life seems from the inside, and both can be mistaken; eudaimonia is a claim about how the life is actually going. Social media is very good at momentary pleasure — whether those pleasures contribute to flourishing is a separate question.</w:t>
       </w:r>
     </w:p>
     <w:bookmarkStart w:id="32" w:name="virtue-and-the-doctrine-of-the-mean"/>
@@ -965,7 +949,7 @@
         <w:t xml:space="preserve">aretē</w:t>
       </w:r>
       <w:r>
-        <w:t xml:space="preserve">), which Aristotle understands as a stable disposition to act, feel, and perceive in an excellent way. Virtues are not rules we follow from the outside; they are traits of character we have internalized through practice. The courageous person does not overcome fear through an act of will on each occasion — courage has become part of who they are.</w:t>
+        <w:t xml:space="preserve">), a stable disposition to act, feel, and perceive in an excellent way. Virtues are not rules followed from outside but traits of character internalized through practice. The courageous person does not overcome fear by an act of will on each occasion — courage has become part of who they are.</w:t>
       </w:r>
     </w:p>
     <w:p>
@@ -989,7 +973,7 @@
         <w:t xml:space="preserve"> </w:t>
       </w:r>
       <w:r>
-        <w:t xml:space="preserve">between two extremes. Courage is the mean between cowardice (too little confidence) and recklessness (too much). Generosity is the mean between miserliness and profligacy. The mean is not a mathematical midpoint; it is what is appropriate to the situation and the person. What counts as appropriate patience when using a search engine might differ from what counts as appropriate patience in a friendship. The person who has practical wisdom —</w:t>
+        <w:t xml:space="preserve">between two extremes: courage between cowardice and recklessness, generosity between miserliness and profligacy. The mean is not a mathematical midpoint but what suits the situation and the person — patience with a search engine differs from patience in a friendship. The person with practical wisdom,</w:t>
       </w:r>
       <w:r>
         <w:t xml:space="preserve"> </w:t>
@@ -1002,10 +986,7 @@
         <w:t xml:space="preserve">phronesis</w:t>
       </w:r>
       <w:r>
-        <w:t xml:space="preserve"> </w:t>
-      </w:r>
-      <w:r>
-        <w:t xml:space="preserve">— is precisely the person who can perceive what virtue requires in each particular situation.</w:t>
+        <w:t xml:space="preserve">, perceives what virtue requires in each case.</w:t>
       </w:r>
     </w:p>
     <w:p>
@@ -1013,7 +994,7 @@
         <w:pStyle w:val="BodyText"/>
       </w:pPr>
       <w:r>
-        <w:t xml:space="preserve">Aristotle distinguishes two broad categories of virtue.</w:t>
+        <w:t xml:space="preserve">Aristotle distinguishes two categories of virtue.</w:t>
       </w:r>
       <w:r>
         <w:t xml:space="preserve"> </w:t>
@@ -1095,7 +1076,7 @@
         <w:t xml:space="preserve"> </w:t>
       </w:r>
       <w:r>
-        <w:t xml:space="preserve">are excellences of character: courage, temperance, justice, generosity, honesty, and friendliness, among others. Phronesis — practical wisdom — is what Aristotle calls the "master virtue" because it is required to apply all the other virtues correctly. It cannot be reduced to rules or algorithms; it requires judgment developed through experience and reflection.</w:t>
+        <w:t xml:space="preserve">are excellences of character: courage, temperance, justice, generosity, honesty. Phronesis is the "master virtue," required to apply all the others correctly; it cannot be reduced to rules or algorithms.</w:t>
       </w:r>
     </w:p>
     <w:p>
@@ -1132,7 +1113,7 @@
         <w:t xml:space="preserve">acquired through practice</w:t>
       </w:r>
       <w:r>
-        <w:t xml:space="preserve">. We become courageous by doing courageous acts, honest by being truthful, patient by bearing difficulty without complaint. The environment in which we practice matters immensely: communities, institutions, and daily habits all shape our developing character. As Aristotle writes, "We become just by doing just acts, temperate by doing temperate acts, brave by doing brave acts." This is why technology is a moral concern at the deepest level — it structures the environment in which we practice being human.</w:t>
+        <w:t xml:space="preserve">. As Aristotle writes, "We become just by doing just acts, temperate by doing temperate acts, brave by doing brave acts." The environment in which we practice therefore matters immensely — which is why technology is a moral concern at the deepest level. It structures where we practice being human.</w:t>
       </w:r>
     </w:p>
     <w:p>
@@ -1149,7 +1130,7 @@
               <a:graphicData uri="http://schemas.openxmlformats.org/drawingml/2006/picture">
                 <pic:pic>
                   <pic:nvPicPr>
-                    <pic:cNvPr descr="/tmp/docx-build-87TwSJ/ch02_virtue_ethics-diagrams/diag_0.png" id="31" name="Picture"/>
+                    <pic:cNvPr descr="/tmp/docx-build-7NZiS3/ch02_virtue_ethics-diagrams/diag_0.png" id="31" name="Picture"/>
                     <pic:cNvPicPr>
                       <a:picLocks noChangeArrowheads="1" noChangeAspect="1"/>
                     </pic:cNvPicPr>
@@ -1207,7 +1188,7 @@
         <w:pStyle w:val="Compact"/>
       </w:pPr>
       <w:r>
-        <w:t xml:space="preserve">Aristotle says each virtue is a mean between excess and deficiency. What would the mean be for time spent online — and who or what should determine it, you or the platform?</w:t>
+        <w:t xml:space="preserve">What would the mean be for time spent online — and who should determine it, you or the platform?</w:t>
       </w:r>
     </w:p>
     <w:p>
@@ -1219,7 +1200,7 @@
         <w:pStyle w:val="Compact"/>
       </w:pPr>
       <w:r>
-        <w:t xml:space="preserve">Can you describe a skill you possess where you can see the right move without being able to state the rule you are following? How close is that to what Aristotle means by phronesis?</w:t>
+        <w:t xml:space="preserve">Describe a skill where you can see the right move without stating the rule you are following. How close is that to phronesis?</w:t>
       </w:r>
     </w:p>
     <w:p>
@@ -1231,7 +1212,7 @@
         <w:pStyle w:val="Compact"/>
       </w:pPr>
       <w:r>
-        <w:t xml:space="preserve">Suppose someone reports being very satisfied with a life you consider wasted. Does Aristotle's account give you any grounds to disagree with them, and should it?</w:t>
+        <w:t xml:space="preserve">Suppose someone reports being very satisfied with a life you consider wasted. Does Aristotle's account give you grounds to disagree, and should it?</w:t>
       </w:r>
     </w:p>
     <w:bookmarkEnd w:id="32"/>
@@ -1320,7 +1301,7 @@
         <w:pStyle w:val="BodyText"/>
       </w:pPr>
       <w:r>
-        <w:t xml:space="preserve">For much of the twentieth century, moral philosophy was dominated by two traditions: Kantian deontology (ethics as rule-following) and utilitarian consequentialism (ethics as maximizing well-being). Both focused on evaluating individual actions rather than character. The revival of virtue ethics as a serious philosophical framework began in the late twentieth century, driven by dissatisfaction with both approaches.</w:t>
+        <w:t xml:space="preserve">For much of the twentieth century, moral philosophy was dominated by Kantian deontology (ethics as rule-following) and utilitarian consequentialism (ethics as maximizing well-being). Both evaluated individual actions rather than character. The revival of virtue ethics began in the late twentieth century, driven by dissatisfaction with both.</w:t>
       </w:r>
     </w:p>
     <w:bookmarkStart w:id="38" w:name="alasdair-macintyre-19292025"/>
@@ -1359,7 +1340,7 @@
         <w:t xml:space="preserve"> </w:t>
       </w:r>
       <w:r>
-        <w:t xml:space="preserve">argued that modern moral philosophy had collapsed into fragmented, incommensurable viewpoints — what he called "emotivism," the view that moral statements are merely expressions of personal preference dressed up in objective-sounding language. MacIntyre contended that virtues are intelligible only within the context of social practices and traditions that give them meaning. His work prompted a major reconsideration of how character, community, and narrative shape moral life.</w:t>
+        <w:t xml:space="preserve">argued that modern moral philosophy had collapsed into fragmented, incommensurable viewpoints — what he called "emotivism," the view that moral statements are merely personal preferences dressed up in objective-sounding language. Virtues, he contended, are intelligible only within the social practices and traditions that give them meaning.</w:t>
       </w:r>
     </w:p>
     <w:bookmarkEnd w:id="38"/>
@@ -1368,7 +1349,7 @@
         <w:pStyle w:val="BodyText"/>
       </w:pPr>
       <w:r>
-        <w:t xml:space="preserve">MacIntyre's diagnosis hits close to home in the age of social media. When moral discourse migrates onto platforms optimized for engagement rather than truth, it tends to become exactly what he feared: a clash of incompatible emotional reactions, amplified by algorithms that reward outrage, with no shared framework for reasoned resolution. He writes that he "can only answer the question 'What am I to do?' if I can answer the prior question 'Of what story or stories do I find myself a part?'" Social media's tendency to fragment our sense of continuous identity — replacing narrative coherence with a feed of disconnected moments — is, on this view, not a trivial inconvenience but a threat to the preconditions of moral life.</w:t>
+        <w:t xml:space="preserve">MacIntyre's diagnosis hits close to home. Moral discourse on platforms optimized for engagement rather than truth becomes what he feared: a clash of incompatible emotional reactions, amplified by algorithms that reward outrage. He writes that he "can only answer the question 'What am I to do?' if I can answer the prior question 'Of what story or stories do I find myself a part?'" Replacing narrative coherence with a feed of disconnected moments is, on this view, a threat to the preconditions of moral life.</w:t>
       </w:r>
     </w:p>
     <w:p>
@@ -1398,20 +1379,7 @@
         <w:t xml:space="preserve"> </w:t>
       </w:r>
       <w:r>
-        <w:t xml:space="preserve">addressed a common objection to virtue ethics: that it fails to give action-guidance. What should I</w:t>
-      </w:r>
-      <w:r>
-        <w:t xml:space="preserve"> </w:t>
-      </w:r>
-      <w:r>
-        <w:rPr>
-          <w:iCs/>
-          <w:i/>
-        </w:rPr>
-        <w:t xml:space="preserve">do</w:t>
-      </w:r>
-      <w:r>
-        <w:t xml:space="preserve">? Her answer is that virtue ethics generates what she calls "v-rules": "Do what is honest," "Do what is compassionate," "Don't do what is cruel." These rules differ from Kantian imperatives in that they derive their content from character rather than obligation, and they must be applied with the practical wisdom to perceive what each situation demands. The virtuous person is not following an external checklist — they have developed the perception and judgment to see what honesty or compassion actually requires here and now.</w:t>
+        <w:t xml:space="preserve">answered a common objection: that virtue ethics fails to guide action. It generates "v-rules" — "Do what is honest," "Don't do what is cruel" — which derive their content from character rather than obligation and must be applied with practical wisdom. The virtuous person is not following a checklist but seeing what honesty requires here and now.</w:t>
       </w:r>
     </w:p>
     <w:p>
@@ -1448,7 +1416,7 @@
         <w:t xml:space="preserve">capabilities approach</w:t>
       </w:r>
       <w:r>
-        <w:t xml:space="preserve">, arguing that human flourishing requires the ability to exercise a core set of distinctively human capacities: life; bodily health; the use of senses, imagination, and thought; the experience of emotions; practical reason; affiliation with others; play; and control over one's environment. The capabilities approach connects virtue ethics to questions of justice and policy: a just society ensures that all its members have access to the conditions necessary for flourishing. When we ask whether social media helps or hinders human flourishing, Nussbaum's list of capabilities provides a useful checklist.</w:t>
+        <w:t xml:space="preserve">: flourishing requires the ability to exercise core human capacities — life; bodily health; senses, imagination, and thought; emotions; practical reason; affiliation; play; and control over one's environment. This connects virtue ethics to justice and policy, and gives us a checklist for asking whether social media helps or hinders.</w:t>
       </w:r>
     </w:p>
     <w:bookmarkStart w:id="39" w:name="shannon-vallor"/>
@@ -1465,7 +1433,7 @@
         <w:pStyle w:val="KeyThinker"/>
       </w:pPr>
       <w:r>
-        <w:t xml:space="preserve">American philosopher of technology, since 2020 the Baillie Gifford Professor in the Ethics of Data and Artificial Intelligence at the University of Edinburgh, where she directs the Centre for Technomoral Futures. Her book</w:t>
+        <w:t xml:space="preserve">American philosopher of technology, since 2020 the Baillie Gifford Professor in the Ethics of Data and AI at the University of Edinburgh, where she directs the Centre for Technomoral Futures. Her</w:t>
       </w:r>
       <w:r>
         <w:t xml:space="preserve"> </w:t>
@@ -1487,7 +1455,7 @@
         <w:t xml:space="preserve"> </w:t>
       </w:r>
       <w:r>
-        <w:t xml:space="preserve">offers the most systematic application of Aristotelian ethics to contemporary digital technologies. Vallor argues that technology is not ethically neutral — through our habitual use of devices and platforms, we cultivate either virtues or vices. She proposes twelve "technomoral virtues" appropriate to the digital age: honesty, self-control, humility, justice, courage, empathy, care, civility, flexibility, perspective, magnanimity, and technomoral wisdom. Her central argument is that human moral character is still shaped by habituation, just as Aristotle thought — but our habituating environment now includes billions of hours of engagement with systems designed for profit rather than flourishing.</w:t>
+        <w:t xml:space="preserve">is the most systematic application of Aristotelian ethics to digital technologies. Technology is not ethically neutral: through habitual use we cultivate either virtues or vices. She proposes twelve "technomoral virtues" for the digital age, from honesty and self-control to magnanimity and technomoral wisdom. Character is still shaped by habituation — but our habituating environment now includes billions of hours with systems designed for profit rather than flourishing.</w:t>
       </w:r>
     </w:p>
     <w:bookmarkEnd w:id="39"/>
@@ -1496,7 +1464,7 @@
         <w:pStyle w:val="BodyText"/>
       </w:pPr>
       <w:r>
-        <w:t xml:space="preserve">Vallor's framework is the bridge between classical virtue ethics and the practical analysis that follows. A useful label for the ambiguity she describes is the ancient Greek word</w:t>
+        <w:t xml:space="preserve">A useful label for the ambiguity Vallor describes is the Greek</w:t>
       </w:r>
       <w:r>
         <w:t xml:space="preserve"> </w:t>
@@ -1509,7 +1477,7 @@
         <w:t xml:space="preserve">pharmakon</w:t>
       </w:r>
       <w:r>
-        <w:t xml:space="preserve">, which meant "poison" and "cure" at once — the same word Plato's Socrates used for writing in the</w:t>
+        <w:t xml:space="preserve">, "poison" and "cure" at once — the word Plato's Socrates used for writing in the</w:t>
       </w:r>
       <w:r>
         <w:t xml:space="preserve"> </w:t>
@@ -1528,7 +1496,7 @@
         <w:t xml:space="preserve">(Plato, 1925)</w:t>
       </w:r>
       <w:r>
-        <w:t xml:space="preserve">, the episode Chapter 1 opened with. Social media is not inherently vicious; it could be designed to cultivate patience, honest discourse, and genuine connection. But as presently constituted, Vallor argues, it tends to habituate users toward intellectual and moral vice. The question, on her account, is not whether technology shapes our character — it already does — but whether we will take conscious control of how it does so.</w:t>
+        <w:t xml:space="preserve">. Social media is not inherently vicious; it could be designed to cultivate patience, honest discourse, and genuine connection. But as presently constituted, Vallor argues, it habituates users toward vice. The question is not whether technology shapes our character — it already does — but whether we will control how.</w:t>
       </w:r>
     </w:p>
     <w:p>
@@ -1548,7 +1516,7 @@
         <w:pStyle w:val="Compact"/>
       </w:pPr>
       <w:r>
-        <w:t xml:space="preserve">MacIntyre claimed you cannot answer "What am I to do?" without first knowing what story you are part of. What story does your social media presence tell about you, and did you choose it?</w:t>
+        <w:t xml:space="preserve">MacIntyre claimed you cannot answer "What am I to do?" without knowing what story you are part of. What story does your social media presence tell, and did you choose it?</w:t>
       </w:r>
     </w:p>
     <w:p>
@@ -1560,7 +1528,7 @@
         <w:pStyle w:val="Compact"/>
       </w:pPr>
       <w:r>
-        <w:t xml:space="preserve">Run Nussbaum's capabilities list — life, health, senses and thought, emotions, practical reason, affiliation, play, control over one's environment — against a platform you use daily. Which does it support, and which does it crowd out?</w:t>
+        <w:t xml:space="preserve">Run Nussbaum's capabilities list against a platform you use daily. Which capabilities does it support, and which does it crowd out?</w:t>
       </w:r>
     </w:p>
     <w:p>
@@ -1572,7 +1540,7 @@
         <w:pStyle w:val="Compact"/>
       </w:pPr>
       <w:r>
-        <w:t xml:space="preserve">Vallor's list of technomoral virtues includes flexibility, perspective, and magnanimity. Which virtue would you add to her twelve for the age of AI, and what practice would develop it?</w:t>
+        <w:t xml:space="preserve">Which virtue would you add to Vallor's twelve for the age of AI, and what practice would develop it?</w:t>
       </w:r>
     </w:p>
     <w:bookmarkEnd w:id="40"/>
@@ -1592,7 +1560,7 @@
         <w:pStyle w:val="FirstParagraph"/>
       </w:pPr>
       <w:r>
-        <w:t xml:space="preserve">The intellectual virtues Aristotle prized — curiosity, love of truth, intellectual humility, open-mindedness, intellectual courage, and intellectual autonomy — are not passive possessions. They are active dispositions that must be continuously exercised and developed. A person becomes intellectually humble by repeatedly confronting the limits of their knowledge and updating their beliefs accordingly. A person becomes genuinely curious by cultivating the habit of following questions wherever they lead, even when the answers are uncomfortable. Like physical fitness, intellectual virtue atrophies without practice.</w:t>
+        <w:t xml:space="preserve">The intellectual virtues Aristotle prized — curiosity, love of truth, humility, open-mindedness, courage, autonomy — are not possessions but active dispositions. One becomes intellectually humble by repeatedly confronting the limits of one's knowledge; curious by following questions wherever they lead. Like physical fitness, intellectual virtue atrophies without practice.</w:t>
       </w:r>
     </w:p>
     <w:p>
@@ -1666,7 +1634,7 @@
         <w:pStyle w:val="BodyText"/>
       </w:pPr>
       <w:r>
-        <w:t xml:space="preserve">Notice that the first premise is a claim about how minds develop, the second is an empirical claim about what particular technologies do, and the third restates Aristotle's account of habituation. Each is separately contestable, and the rest of this section examines them in turn. That is the honest way to hold an argument like this one: not as a verdict already reached, but as a set of commitments that can be checked.</w:t>
+        <w:t xml:space="preserve">The first premise is about how minds develop, the second an empirical claim about what technologies do, the third a restatement of Aristotle on habituation. Each is separately contestable, and this section examines them in turn — as commitments to be checked, not a verdict reached.</w:t>
       </w:r>
     </w:p>
     <w:bookmarkStart w:id="42" w:name="the-attention-crisis"/>
@@ -1683,7 +1651,7 @@
         <w:pStyle w:val="FirstParagraph"/>
       </w:pPr>
       <w:r>
-        <w:t xml:space="preserve">In his influential book</w:t>
+        <w:t xml:space="preserve">In</w:t>
       </w:r>
       <w:r>
         <w:t xml:space="preserve"> </w:t>
@@ -1702,7 +1670,7 @@
         <w:t xml:space="preserve">(Carr, 2010)</w:t>
       </w:r>
       <w:r>
-        <w:t xml:space="preserve">, journalist and technology critic Nicholas Carr argued that internet use is literally rewiring the brain for distraction. The case is not that the internet makes us less intelligent in the IQ sense; it is that habitual digital media use trains the mind toward shallow, rapid scanning at the expense of the deep, slow, sustained attention that is necessary for genuine intellectual development. Deep reading — the kind that allows us to follow complex arguments, inhabit another perspective, and integrate new information with what we already know — requires a mind capable of holding attention over extended periods. Carr argues that this capacity is being degraded by the constant interruptions, hyperlinks, and notifications that define the internet experience.</w:t>
+        <w:t xml:space="preserve">, journalist and technology critic Nicholas Carr argued that internet use is rewiring the brain for distraction. The case is not that the internet makes us less intelligent, but that habitual media use trains the mind toward shallow, rapid scanning at the expense of sustained attention. Deep reading — following complex arguments, inhabiting another perspective — needs attention held over long periods, a capacity Carr argues is degraded by constant interruptions and notifications.</w:t>
       </w:r>
     </w:p>
     <w:p>
@@ -1722,7 +1690,7 @@
         <w:t xml:space="preserve"> </w:t>
       </w:r>
       <w:r>
-        <w:t xml:space="preserve">adds a generational dimension to this concern. The shift to smartphones as the primary medium of teenage social life, which he dates to around 2012, coincided with rising rates of reported depression and anxiety and with declines in the time teenagers spend reading books and talking face-to-face. Whether these trends are causally connected is genuinely disputed, and the section on eudaimonia below examines that dispute in detail. The proposed mechanism is what technology researchers call</w:t>
+        <w:t xml:space="preserve">adds a generational dimension. The shift to smartphones as the main medium of teenage social life, which he dates to around 2012, coincided with rising reported depression and anxiety and declines in book-reading and face-to-face talk. Whether these trends are causally connected is genuinely disputed; the eudaimonia section takes up that dispute. The proposed mechanism is</w:t>
       </w:r>
       <w:r>
         <w:t xml:space="preserve"> </w:t>
@@ -1735,7 +1703,7 @@
         <w:t xml:space="preserve">continuous partial attention</w:t>
       </w:r>
       <w:r>
-        <w:t xml:space="preserve">: a chronic state in which no single task ever receives full concentration because attention is always partially allocated to monitoring incoming notifications, messages, and social signals. William James, one of the founders of modern psychology, identified the capacity to return a wandering attention voluntarily as "the very root of judgment, character, and will"</w:t>
+        <w:t xml:space="preserve">: no task gets full concentration because attention is always partly on incoming notifications. William James called the capacity to return a wandering attention voluntarily "the very root of judgment, character, and will"</w:t>
       </w:r>
       <w:r>
         <w:t xml:space="preserve"> </w:t>
@@ -1744,7 +1712,7 @@
         <w:t xml:space="preserve">(James, 1890)</w:t>
       </w:r>
       <w:r>
-        <w:t xml:space="preserve">. If he was right, the continuous partial attention cultivated by smartphone use is undermining something fundamental.</w:t>
+        <w:t xml:space="preserve">.</w:t>
       </w:r>
     </w:p>
     <w:p>
@@ -1890,7 +1858,7 @@
         <w:pStyle w:val="BodyText"/>
       </w:pPr>
       <w:r>
-        <w:t xml:space="preserve">The 47-second figure is worth handling carefully, because it is one of the most frequently mangled statistics in the whole debate. Mark's teams measured how long a person's focus stayed on one screen or window before shifting to another, in observational studies of people doing knowledge work</w:t>
+        <w:t xml:space="preserve">The 47-second figure is among the most frequently mangled statistics in the debate. In observational studies of knowledge work, Mark's teams measured how long focus stayed on one screen before shifting</w:t>
       </w:r>
       <w:r>
         <w:t xml:space="preserve"> </w:t>
@@ -1899,7 +1867,10 @@
         <w:t xml:space="preserve">(Mark, 2023)</w:t>
       </w:r>
       <w:r>
-        <w:t xml:space="preserve">. That is a measure of screen-switching behavior, not a measure of the mind's capacity for concentration. Popular retellings routinely convert it into "the human attention span has fallen to 47 seconds," which is a different and much stronger claim that the research does not establish. The underlying finding still matters — a better-than-threefold increase in switching over two decades is a real change in how attention is spent — but a virtue ethicist committed to the love of truth should be the first to notice when a statistic has been upgraded in transit. Figures for how often people check their phones each day should be treated with the same caution: published estimates range from roughly 60 to well over 150, depending on whether "checking" is self-reported or logged by software, and the widely repeated round numbers are not stable enough to build an argument on.</w:t>
+        <w:t xml:space="preserve"> </w:t>
+      </w:r>
+      <w:r>
+        <w:t xml:space="preserve">— screen-switching behavior, not the mind's capacity for concentration. Popular retellings convert it into "the human attention span has fallen to 47 seconds," a much stronger claim the research does not establish. The finding still matters: a better-than-threefold increase in switching over two decades is a real change. A virtue ethicist committed to the love of truth should be first to notice a statistic upgraded in transit. Treat phone-checking counts the same way — estimates range from roughly 60 to well over 150 a day depending on whether checking is self-reported or logged.</w:t>
       </w:r>
     </w:p>
     <w:bookmarkEnd w:id="42"/>
@@ -1957,7 +1928,7 @@
         <w:pStyle w:val="BodyText"/>
       </w:pPr>
       <w:r>
-        <w:t xml:space="preserve">Offloading is ancient and often sensible; a shopping list is cognitive offloading. What makes the digital case distinctive is scale and automaticity. The best-known experimental evidence comes from a set of studies by Betsy Sparrow and her colleagues, described in the case study below</w:t>
+        <w:t xml:space="preserve">Offloading is ancient and often sensible; a shopping list is cognitive offloading. What makes the digital case distinctive is scale and automaticity. The best-known evidence, from Betsy Sparrow and colleagues</w:t>
       </w:r>
       <w:r>
         <w:t xml:space="preserve"> </w:t>
@@ -1966,7 +1937,10 @@
         <w:t xml:space="preserve">(Sparrow et al., 2011)</w:t>
       </w:r>
       <w:r>
-        <w:t xml:space="preserve">. Their central finding is that when people expect to be able to look information up later, they are less likely to encode it in memory, and they remember where to find a fact more readily than the fact itself. This pattern, quickly nicknamed the "Google Effect," suggests that ready access to search may be changing how we relate to knowledge — shifting us from knowers who have internalized information and can reason with it toward retrievers who know how to locate it.</w:t>
+        <w:t xml:space="preserve"> </w:t>
+      </w:r>
+      <w:r>
+        <w:t xml:space="preserve">and described below, is that people who expect to look something up later are less likely to encode it. This "Google Effect" may be shifting us from knowers who have internalized information to retrievers who know where to find it.</w:t>
       </w:r>
     </w:p>
     <w:p>
@@ -1990,7 +1964,7 @@
         <w:pStyle w:val="CaseStudy"/>
       </w:pPr>
       <w:r>
-        <w:t xml:space="preserve">In July 2011, the psychologists Betsy Sparrow, Jenny Liu, and Daniel Wegner published "Google Effects on Memory: Cognitive Consequences of Having Information at Our Fingertips" in</w:t>
+        <w:t xml:space="preserve">In July 2011, psychologists Betsy Sparrow, Jenny Liu, and Daniel Wegner published "Google Effects on Memory" in</w:t>
       </w:r>
       <w:r>
         <w:t xml:space="preserve"> </w:t>
@@ -2009,7 +1983,7 @@
         <w:t xml:space="preserve">(Sparrow et al., 2011)</w:t>
       </w:r>
       <w:r>
-        <w:t xml:space="preserve">. The paper reported four experiments designed to test a simple question: does knowing that a computer will remember something for you change whether you remember it yourself?</w:t>
+        <w:t xml:space="preserve">: four experiments testing whether knowing that a computer will remember something for you changes whether you remember it yourself.</w:t>
       </w:r>
     </w:p>
     <w:p>
@@ -2017,7 +1991,7 @@
         <w:pStyle w:val="CaseStudy"/>
       </w:pPr>
       <w:r>
-        <w:t xml:space="preserve">In one experiment, participants typed forty short trivia statements into a computer. Half were told the file would be saved; half were told it would be erased. Everyone was asked to try to remember the statements. Those who believed the computer had saved the information recalled significantly fewer statements than those who believed it had been erased — even though both groups had done exactly the same typing and had been given the same instruction. In a further experiment, participants who saved each statement into a named folder recalled the folder better than the statement. Memory had reorganized itself around retrieval paths rather than content.</w:t>
+        <w:t xml:space="preserve">In one, participants typed forty short trivia statements into a computer. Half were told the file would be saved; half that it would be erased. All were asked to remember them. Those who believed the information had been saved recalled significantly fewer, despite identical typing and instructions. In a further experiment, participants who saved each statement into a named folder recalled the folder better than the statement — memory reorganized around retrieval paths.</w:t>
       </w:r>
     </w:p>
     <w:p>
@@ -2025,7 +1999,7 @@
         <w:pStyle w:val="CaseStudy"/>
       </w:pPr>
       <w:r>
-        <w:t xml:space="preserve">Two cautions belong with this case. The effects were modest, and later replication work on the Google Effect has produced mixed results, so it should be treated as suggestive rather than settled. Still, the mechanism it proposes is exactly the one virtue ethics cares about: not that people became lazy, but that the presence of a reliable external memory silently changed what their minds bothered to do. If intellectual virtue is built by effortful practice, a change in what we practice is a change in who we become.</w:t>
+        <w:t xml:space="preserve">Two cautions: the effects were modest, and later replication work has been mixed, so treat this as suggestive rather than settled. Still, the mechanism is the one virtue ethics cares about — not laziness, but a reliable external memory silently changing what minds bothered to do.</w:t>
       </w:r>
     </w:p>
     <w:p>
@@ -2033,7 +2007,7 @@
         <w:pStyle w:val="BodyText"/>
       </w:pPr>
       <w:r>
-        <w:t xml:space="preserve">Carr notes that the medieval monks who invented many techniques of deep reading understood something important: committing texts to memory is not mere rote learning but a process that allows ideas to combine, resonate, and generate new thoughts. When information is stored externally rather than internally, this generative process is curtailed. The concern is not primarily that Google makes us lazy — it is that the practice of effortful memory work is itself a form of intellectual exercise that builds the cognitive capacities underlying intellectual virtue. When AI writing tools now offer to compose arguments, analyze texts, and synthesize sources on our behalf, the deskilling concern deepens: we lose not only the product of the effort, but the intellectual character that the effort was building.</w:t>
+        <w:t xml:space="preserve">Carr notes that the medieval monks who invented many techniques of deep reading understood something important: committing texts to memory is not rote learning but a process that lets ideas combine and generate new thoughts. Stored externally, information cannot do this. And when AI tools compose arguments on our behalf, we lose not only the product of the effort but the intellectual character it was building.</w:t>
       </w:r>
     </w:p>
     <w:bookmarkEnd w:id="43"/>
@@ -2063,7 +2037,7 @@
         <w:t xml:space="preserve"> </w:t>
       </w:r>
       <w:r>
-        <w:t xml:space="preserve">draws an important distinction that is easy to miss. An</w:t>
+        <w:t xml:space="preserve">draws a distinction easy to miss. An</w:t>
       </w:r>
       <w:r>
         <w:t xml:space="preserve"> </w:t>
@@ -2079,7 +2053,7 @@
         <w:t xml:space="preserve"> </w:t>
       </w:r>
       <w:r>
-        <w:t xml:space="preserve">is a social environment in which you are simply not exposed to certain viewpoints or sources of information — an information gap. An</w:t>
+        <w:t xml:space="preserve">is an information gap: you are simply not exposed to certain viewpoints. An</w:t>
       </w:r>
       <w:r>
         <w:t xml:space="preserve"> </w:t>
@@ -2095,7 +2069,7 @@
         <w:t xml:space="preserve"> </w:t>
       </w:r>
       <w:r>
-        <w:t xml:space="preserve">is something more insidious: an environment in which the voices outside your circle have been actively discredited, so that exposure to contrary evidence no longer updates your beliefs but rather reinforces your suspicion of the messenger. Epistemic bubbles can be corrected by exposure; echo chambers cannot, because the very mechanism for correction has been disabled.</w:t>
+        <w:t xml:space="preserve">is more insidious — outside voices have been discredited, so contrary evidence reinforces suspicion of the messenger instead of updating belief. Bubbles are corrected by exposure; echo chambers cannot be, because the mechanism of correction is disabled.</w:t>
       </w:r>
     </w:p>
     <w:p>
@@ -2288,7 +2262,7 @@
         <w:pStyle w:val="BodyText"/>
       </w:pPr>
       <w:r>
-        <w:t xml:space="preserve">Algorithmic curation on social media tends to create bubbles by design — the recommendation engine learns what you engage with and shows you more of the same. For instance, a person who clicks on a few videos skeptical of vaccine safety will, on YouTube and TikTok, be served progressively more content from the same cluster of creators — not because those creators are correct or popular, but because that person's engagement pattern predicts more engagement with similar material. The bubble has formed, and the person may not even be aware of it: they now "know" a great deal about vaccine skepticism and very little about the mainstream scientific literature. The echo chamber is the more advanced stage: they have also learned, from their curated feed, to treat anyone who cites mainstream sources as a paid shill or a credulous dupe.</w:t>
+        <w:t xml:space="preserve">Algorithmic curation creates bubbles by design. Someone who clicks a few videos skeptical of vaccine safety is served progressively more from the same cluster of creators — not because they are correct, but because that pattern predicts more engagement. They now "know" much about vaccine skepticism and little about the scientific literature. At the echo chamber stage, they have also learned to treat anyone citing mainstream sources as a paid shill.</w:t>
       </w:r>
     </w:p>
     <w:bookmarkEnd w:id="44"/>
@@ -2306,7 +2280,7 @@
         <w:pStyle w:val="FirstParagraph"/>
       </w:pPr>
       <w:r>
-        <w:t xml:space="preserve">The most recent and perhaps most profound challenge to intellectual virtue comes from large language model AI systems — tools like ChatGPT that can generate plausible-sounding essays, solve problems, explain concepts, and engage in sophisticated dialogue. Vallor warns of "moral deskilling" through automation: the gradual erosion of human capacities when machines take over tasks we once performed ourselves</w:t>
+        <w:t xml:space="preserve">The most recent challenge comes from large language models. Vallor warns of "moral deskilling": the erosion of human capacities when machines take over tasks we once performed</w:t>
       </w:r>
       <w:r>
         <w:t xml:space="preserve"> </w:t>
@@ -2315,7 +2289,7 @@
         <w:t xml:space="preserve">(Vallor, 2016)</w:t>
       </w:r>
       <w:r>
-        <w:t xml:space="preserve">. The concern about AI writing and reasoning tools is analogous to the concern about calculators, but goes deeper: when a student uses a calculator, they bypass one specific skill; when they use an AI to write their argument, they may bypass the entire process of intellectual struggle through which analytical thinking is developed.</w:t>
+        <w:t xml:space="preserve">. The worry is analogous to the one about calculators but deeper — a calculator bypasses one skill, while an AI that writes your argument may bypass the whole struggle through which analytical thinking develops.</w:t>
       </w:r>
     </w:p>
     <w:p>
@@ -2323,7 +2297,7 @@
         <w:pStyle w:val="BodyText"/>
       </w:pPr>
       <w:r>
-        <w:t xml:space="preserve">Aristotle held that virtues require practice — we cannot become courageous without doing courageous things, intellectually curious without following our curiosity into difficult territory. AI tools that provide answers without requiring us to develop understanding are, on this view, not merely time-saving conveniences. They are environments that habituate us toward intellectual passivity — toward expecting answers rather than working for understanding. Consider the difference between two students writing a philosophy essay. One spends an hour struggling to articulate what Kant means by the categorical imperative, discarding three drafts, rereading the original text, and finally arriving at a formulation they can defend. The other types a prompt into an AI and receives a polished paragraph in ten seconds. The second student has a product; the first has developed a capacity. For a virtue ethicist, this distinction is not pedantic — the capacity, built through the struggle, is the whole point. Whether this concern is fully warranted is an empirical question that will take years to answer. But it is precisely the question a virtue ethicist would ask.</w:t>
+        <w:t xml:space="preserve">Consider two students writing a philosophy essay. One spends an hour struggling to articulate Kant's categorical imperative, discarding drafts, rereading the original, finally arriving at a formulation they can defend. The other types a prompt and gets a polished paragraph in ten seconds. The second has a product; the first has a capacity — and the capacity, built through the struggle, is the whole point. Whether the concern is warranted will take years to settle empirically, but it is the question a virtue ethicist would ask.</w:t>
       </w:r>
     </w:p>
     <w:p>
@@ -2367,19 +2341,7 @@
         <w:pStyle w:val="Compact"/>
       </w:pPr>
       <w:r>
-        <w:t xml:space="preserve">Where is the line between a helpful tool that extends human capability and a crutch that atrophies it?</w:t>
-      </w:r>
-    </w:p>
-    <w:p>
-      <w:pPr>
-        <w:numPr>
-          <w:ilvl w:val="0"/>
-          <w:numId w:val="1006"/>
-        </w:numPr>
-        <w:pStyle w:val="Compact"/>
-      </w:pPr>
-      <w:r>
-        <w:t xml:space="preserve">The "47 seconds" statistic is true of screen-switching and false as a claim about attention spans. What would you need to check before repeating a striking number you saw online?</w:t>
+        <w:t xml:space="preserve">The "47 seconds" statistic is true of screen-switching and false about attention spans. What would you check before repeating a striking number you saw online?</w:t>
       </w:r>
     </w:p>
     <w:bookmarkEnd w:id="45"/>
@@ -2400,7 +2362,7 @@
         <w:pStyle w:val="FirstParagraph"/>
       </w:pPr>
       <w:r>
-        <w:t xml:space="preserve">If intellectual virtues are developed through effortful cognitive practice, moral virtues are developed through the difficult, irreplaceable work of living alongside other people. Empathy develops through sustained exposure to others' vulnerability — learning to see their pain as real, their perspective as legitimate, their emotional reality as something you can imaginatively inhabit. Patience develops through waiting, tolerating discomfort, learning that not everything comes instantly. Honesty develops through the repeated practice of choosing truth over convenience, and experiencing the trust that builds as a result. A good example of how digital mediation can thin out these practices: consider what is lost when a difficult conversation that would once have happened face-to-face is instead conducted by text message. The recipient does not see your hesitation, hear the tension in your voice, or have the chance to respond to your expression in real time. You do not have to sit with their pain. Both of you have been spared the discomfort that is, arguably, where moral learning happens.</w:t>
+        <w:t xml:space="preserve">If intellectual virtues are developed through effortful cognitive practice, moral virtues are developed through the irreplaceable work of living alongside other people. Empathy develops through exposure to others' vulnerability; patience through waiting; honesty through repeatedly choosing truth over convenience. Consider what is lost when a difficult conversation that would once have been face-to-face is conducted by text. The recipient does not see your hesitation; you do not sit with their pain. Both have been spared the discomfort that is, arguably, where moral learning happens.</w:t>
       </w:r>
     </w:p>
     <w:p>
@@ -2474,7 +2436,7 @@
         <w:pStyle w:val="BodyText"/>
       </w:pPr>
       <w:r>
-        <w:t xml:space="preserve">The structure mirrors Argument 1, and so do its vulnerabilities. The third premise is the boldest: it says not merely that online life offers fewer chances to practice virtue, but that it supplies active practice in vice. That is the premise the rest of this section defends, and it is also the one an opponent should attack first.</w:t>
+        <w:t xml:space="preserve">The structure mirrors Argument 1, and so do its vulnerabilities. The third premise is boldest: not merely that online life offers fewer chances to practice virtue, but that it supplies active practice in vice. That is what this section defends, and what an opponent should attack first.</w:t>
       </w:r>
     </w:p>
     <w:bookmarkStart w:id="48" w:name="Xdaf72df8d5ff44f556f28474a1e7d267f49c883"/>
@@ -2491,7 +2453,7 @@
         <w:pStyle w:val="FirstParagraph"/>
       </w:pPr>
       <w:r>
-        <w:t xml:space="preserve">MIT sociologist Sherry Turkle has spent decades studying how people relate to technology, and her findings paint a troubling picture. In</w:t>
+        <w:t xml:space="preserve">MIT sociologist Sherry Turkle has spent decades studying how people relate to technology. In</w:t>
       </w:r>
       <w:r>
         <w:t xml:space="preserve"> </w:t>
@@ -2510,7 +2472,7 @@
         <w:t xml:space="preserve">(Turkle, 2015)</w:t>
       </w:r>
       <w:r>
-        <w:t xml:space="preserve">, she argues that face-to-face conversation is irreplaceable as the context in which empathy develops. When we speak to someone in person, we receive a continuous stream of non-verbal information — facial expressions, posture, tone of voice, eye contact — that makes their inner life viscerally present to us. We learn to tolerate awkward silences. We receive immediate feedback when our words land wrong. We must be present to another human being in their full, unedited complexity. These demands are uncomfortable, and avoiding them is exactly what text-based digital communication allows us to do.</w:t>
+        <w:t xml:space="preserve">, she argues that face-to-face conversation is irreplaceable as the context in which empathy develops. In person we receive a continuous stream of non-verbal information — expression, posture, tone, eye contact — that makes another's inner life viscerally present, and we get immediate feedback when our words land wrong. Avoiding those demands is exactly what text-based communication allows.</w:t>
       </w:r>
     </w:p>
     <w:p>
@@ -2518,7 +2480,7 @@
         <w:pStyle w:val="BodyText"/>
       </w:pPr>
       <w:r>
-        <w:t xml:space="preserve">The problem is that these demands are not merely annoying obstacles to efficient communication — they are, Turkle argues, the moral substance of human relationship. "Face-to-face conversation is the most human — and humanizing — thing we do," she writes. "Fully present to one another, we learn to listen. It's where we develop the capacity for empathy." When teens spend more time communicating by text than in person, they are practicing a thinner form of social interaction — one that requires and develops less empathy, patience, and social skill. There is some quantitative support for the worry. A cross-temporal meta-analysis by Sara Konrath and colleagues, pooling seventy-two samples of American college students who completed the Interpersonal Reactivity Index between 1979 and 2009, found that self-reported empathic concern and perspective-taking fell by roughly 40 percent, with the sharpest declines appearing in samples collected after 2000</w:t>
+        <w:t xml:space="preserve">The demands are, Turkle argues, the moral substance of relationship. "Face-to-face conversation is the most human — and humanizing — thing we do," she writes. "Fully present to one another, we learn to listen. It's where we develop the capacity for empathy." There is some quantitative support: a cross-temporal meta-analysis by Sara Konrath and colleagues, pooling seventy-two samples of American college students who took the Interpersonal Reactivity Index between 1979 and 2009, found self-reported empathic concern and perspective-taking down roughly 40 percent, sharpest after 2000</w:t>
       </w:r>
       <w:r>
         <w:t xml:space="preserve"> </w:t>
@@ -2527,7 +2489,7 @@
         <w:t xml:space="preserve">(Konrath et al., 2011)</w:t>
       </w:r>
       <w:r>
-        <w:t xml:space="preserve">. Two qualifications matter. These are self-reports on a questionnaire, not observed behavior. And the data end in 2009, before smartphones were widespread, so the study cannot be used as evidence that smartphones caused the decline — at most it shows that something was already eroding self-reported empathy during the early internet era.</w:t>
+        <w:t xml:space="preserve">. Two qualifications: these are self-reports, not observed behavior, and the data end in 2009, before smartphones were widespread — so the study cannot show smartphones caused the decline, only that something was already eroding self-reported empathy in the early internet era.</w:t>
       </w:r>
     </w:p>
     <w:bookmarkEnd w:id="48"/>
@@ -2762,7 +2724,7 @@
         <w:pStyle w:val="BodyText"/>
       </w:pPr>
       <w:r>
-        <w:t xml:space="preserve">Suler's list is not a list of excuses. It is a list of the ordinary restraints that in-person life supplies and that online environments remove. From a virtue ethics perspective, online disinhibition is therefore not primarily a technical problem to be solved by better content moderation. It is a moral habituation problem. Every time a person says something cruel online that they would not say to a face, they practice cruelty. Every cruel act, if Aristotle is right, shapes character in the direction of cruelty. The normalization of aggressive, dismissive, and dishonest speech online is not merely unpleasant — it is moral training in the wrong direction, repeated on an enormous scale.</w:t>
+        <w:t xml:space="preserve">Suler's list is not a list of excuses but of the ordinary restraints in-person life supplies and online environments remove. Online disinhibition is therefore a moral habituation problem, not a content-moderation problem. Every time a person says something cruel online that they would not say to a face, they practice cruelty — and every cruel act, if Aristotle is right, shapes character in that direction.</w:t>
       </w:r>
     </w:p>
     <w:p>
@@ -2786,7 +2748,7 @@
         <w:pStyle w:val="CaseStudy"/>
       </w:pPr>
       <w:r>
-        <w:t xml:space="preserve">On 20 December 2013, Justine Sacco, a corporate communications director at the media company IAC, posted a tasteless joke to her Twitter account before boarding an eleven-hour flight from London to Cape Town: "Going to Africa. Hope I don't get AIDS. Just kidding. I'm white!" She had 170 followers. Then she turned off her phone and got on the plane.</w:t>
+        <w:t xml:space="preserve">On 20 December 2013, Justine Sacco, a corporate communications director at the media company IAC, posted a tasteless joke to her Twitter account before boarding an eleven-hour flight from London to Cape Town: "Going to Africa. Hope I don't get AIDS. Just kidding. I'm white!" She had 170 followers. Then she turned off her phone.</w:t>
       </w:r>
     </w:p>
     <w:p>
@@ -2794,7 +2756,7 @@
         <w:pStyle w:val="CaseStudy"/>
       </w:pPr>
       <w:r>
-        <w:t xml:space="preserve">By the time she landed, the tweet had been amplified to a global audience and the hashtag #HasJustineLandedYet was the top trending topic worldwide. Thousands of people who had never heard of her spent the day composing jokes about her, calls for her firing, and — in a substantial number of cases — wishes that she be raped or infected with HIV. One user went to Cape Town airport to photograph her arrival. She was fired, and the journalist Jon Ronson later devoted a chapter of</w:t>
+        <w:t xml:space="preserve">By the time she landed, #HasJustineLandedYet was the top trending topic worldwide. Thousands who had never heard of her spent the day composing jokes, calls for her firing, and — in many cases — wishes that she be raped or infected with HIV. One user went to Cape Town airport to photograph her arrival. She was fired, and Jon Ronson later reconstructed the episode in</w:t>
       </w:r>
       <w:r>
         <w:t xml:space="preserve"> </w:t>
@@ -2810,12 +2772,6 @@
         <w:t xml:space="preserve"> </w:t>
       </w:r>
       <w:r>
-        <w:t xml:space="preserve">to reconstructing what had happened to her and to the people who had piled on</w:t>
-      </w:r>
-      <w:r>
-        <w:t xml:space="preserve"> </w:t>
-      </w:r>
-      <w:r>
         <w:t xml:space="preserve">(Ronson, 2015)</w:t>
       </w:r>
       <w:r>
@@ -2827,7 +2783,7 @@
         <w:pStyle w:val="CaseStudy"/>
       </w:pPr>
       <w:r>
-        <w:t xml:space="preserve">What makes the case philosophically interesting is not the original tweet, which almost everyone agrees was ugly. It is the pile-on. Ronson found that the participants, interviewed afterward, were largely decent people who experienced the day as a satisfying act of collective justice. Every factor in Suler's table was in play at once: they could not see her, she could not answer, the crowd supplied cover, and the reward — likes, retweets, the pleasure of a well-received joke — arrived immediately. This is what Aristotle's account predicts should be corrupting: not one monstrous choice by one monstrous person, but ordinary people getting a great deal of pleasurable practice at cruelty and calling it justice.</w:t>
+        <w:t xml:space="preserve">What makes the case philosophically interesting is not the tweet but the pile-on. Ronson found that participants, interviewed afterward, were largely decent people who experienced the day as a satisfying act of collective justice. Every factor in Suler's table was in play: they could not see her, she could not answer, the crowd gave cover, the reward arrived immediately. This is what Aristotle predicts should be corrupting — not one monstrous choice by one monstrous person, but ordinary people getting a great deal of pleasurable practice at cruelty and calling it justice.</w:t>
       </w:r>
     </w:p>
     <w:bookmarkEnd w:id="49"/>
@@ -2845,7 +2801,7 @@
         <w:pStyle w:val="FirstParagraph"/>
       </w:pPr>
       <w:r>
-        <w:t xml:space="preserve">Jonathan Haidt's research on social media's transformation of political and social discourse pinpoints 2009 as a pivotal year</w:t>
+        <w:t xml:space="preserve">Jonathan Haidt's research on social media's transformation of public discourse pinpoints 2009 as pivotal</w:t>
       </w:r>
       <w:r>
         <w:t xml:space="preserve"> </w:t>
@@ -2854,7 +2810,7 @@
         <w:t xml:space="preserve">(Haidt, 2024)</w:t>
       </w:r>
       <w:r>
-        <w:t xml:space="preserve">. That year, Facebook added the Like button and Twitter added the Retweet function — seemingly small design choices that fundamentally altered the incentive structure of online communication. Content that generates strong emotional reactions — particularly anger and moral outrage — receives more engagement than nuanced, balanced content. Engagement is rewarded by algorithmic amplification. This creates a self-reinforcing cycle in which the emotional temperature of public discourse rises continuously, users are trained toward emotional extremism, and content that would once have been considered inflammatory becomes routine.</w:t>
+        <w:t xml:space="preserve">. That year Facebook added the Like button and Twitter the Retweet — small design choices that altered the incentive structure of online communication. Content generating anger and moral outrage gets more engagement, and engagement is rewarded by amplification. The cycle is self-reinforcing: emotional temperature rises, users are trained toward extremism, and what was once inflammatory becomes routine.</w:t>
       </w:r>
     </w:p>
     <w:p>
@@ -2887,7 +2843,7 @@
         <w:t xml:space="preserve">(Tosi &amp; Warmke, 2016)</w:t>
       </w:r>
       <w:r>
-        <w:t xml:space="preserve">, and taken up by Haidt and others as a description of what engagement-optimized platforms select for. The grandstander publicly performs outrage as a social signal rather than acting to address the problem. A person who spends an hour sharing angry posts about a social injustice has "done something" in a socially legible way while expending no effort that addresses the underlying problem. From an Aristotelian view, this is worse than mere inaction: it habituates the person toward the performance of virtue while bypassing the practice of virtue itself. The gap between apparent virtue and actual character is precisely what Aristotle called vice.</w:t>
+        <w:t xml:space="preserve">, and taken up by Haidt and others to describe what engagement-optimized platforms select for. The grandstander performs outrage rather than acting: an hour spent sharing angry posts counts as "doing something" while addressing nothing. On an Aristotelian view this is worse than inaction, habituating a person toward the performance of virtue while bypassing its practice.</w:t>
       </w:r>
     </w:p>
     <w:bookmarkEnd w:id="50"/>
@@ -2905,7 +2861,7 @@
         <w:pStyle w:val="FirstParagraph"/>
       </w:pPr>
       <w:r>
-        <w:t xml:space="preserve">Digital platforms also enable and reward systematic inauthenticity. The carefully curated Instagram profile — the best photos, the happiest moments, the most flattering angles — creates a performed identity that diverges increasingly from lived experience. The gap between the self presented online and the self actually lived is a form of ongoing dishonesty, not just toward one's audience but toward oneself. Over time, Turkle argues in</w:t>
+        <w:t xml:space="preserve">Digital platforms also reward systematic inauthenticity. The curated profile creates a performed identity that diverges from lived experience — an ongoing dishonesty toward one's audience and oneself. Over time, Turkle argues in</w:t>
       </w:r>
       <w:r>
         <w:t xml:space="preserve"> </w:t>
@@ -2924,7 +2880,7 @@
         <w:t xml:space="preserve">(Turkle, 2011)</w:t>
       </w:r>
       <w:r>
-        <w:t xml:space="preserve">, the performance can come to feel more real than the reality: people begin managing their lives to generate content for their feeds rather than experiencing life directly.</w:t>
+        <w:t xml:space="preserve">, the performance can feel more real than the reality: people manage their lives to generate content rather than living directly.</w:t>
       </w:r>
     </w:p>
     <w:p>
@@ -2932,7 +2888,7 @@
         <w:pStyle w:val="BodyText"/>
       </w:pPr>
       <w:r>
-        <w:t xml:space="preserve">Hannah Arendt, whose work on the social conditions of political life is among the most important of the twentieth century, warned that the erosion of a shared sense of reality is one of the preconditions of political tyranny.</w:t>
+        <w:t xml:space="preserve">Hannah Arendt warned that the erosion of a shared sense of reality is one of the preconditions of tyranny.</w:t>
       </w:r>
     </w:p>
     <w:p>
@@ -2956,7 +2912,7 @@
         <w:pStyle w:val="BodyText"/>
       </w:pPr>
       <w:r>
-        <w:t xml:space="preserve">Arendt was describing the 1930s and 1940s, not the internet, and the analogy should not be pressed too far. But her point was structural rather than historical: tyranny does not require that everyone believe a particular lie, only that enough people stop believing that the difference between true and false is worth maintaining. When the distinction between fact and fiction becomes optional — when deepfakes, AI-generated content, and strategic misinformation make it genuinely difficult to know what is real — the democratic practices that depend on a shared factual world are severely threatened. The individual virtue of honesty has collective political stakes.</w:t>
+        <w:t xml:space="preserve">Arendt was describing the 1930s and 1940s, not the internet, and the analogy should not be pressed far. But her point was structural: tyranny does not require that everyone believe a lie, only that enough people stop believing the difference between true and false is worth maintaining. When deepfakes and strategic misinformation make it hard to know what is real, practices that depend on a shared factual world are threatened. Honesty has collective political stakes.</w:t>
       </w:r>
     </w:p>
     <w:p>
@@ -3217,7 +3173,7 @@
         <w:pStyle w:val="BodyText"/>
       </w:pPr>
       <w:r>
-        <w:t xml:space="preserve">The right-hand column is deliberately unflattering, and a fair reader should push back on it. Each row describes a substitution rather than a straightforward loss: text-based interaction is thinner than conversation but reaches people conversation cannot; pseudonymity shelters harassers but also whistleblowers and people who cannot safely speak under their own names. The claim the table is making is not that every digital practice is worse than what it replaced, but that the replacements demand less of us — and virtue, on Aristotle's account, is built precisely by what demands something of us.</w:t>
+        <w:t xml:space="preserve">The right-hand column is deliberately unflattering, and a fair reader should push back. Each row is a substitution rather than a loss: text reaches people conversation cannot; pseudonymity shelters harassers but also whistleblowers. The claim is not that every digital practice is worse, but that the replacements demand less of us — and virtue is built by what demands something of us.</w:t>
       </w:r>
     </w:p>
     <w:p>
@@ -3249,7 +3205,7 @@
         <w:pStyle w:val="Compact"/>
       </w:pPr>
       <w:r>
-        <w:t xml:space="preserve">Think about your social media profile. In what ways does it represent who you actually are, and in what ways does it represent who you want to appear to be?</w:t>
+        <w:t xml:space="preserve">In what ways does your social media profile represent who you actually are, and in what ways who you want to appear to be?</w:t>
       </w:r>
     </w:p>
     <w:p>
@@ -3261,19 +3217,7 @@
         <w:pStyle w:val="Compact"/>
       </w:pPr>
       <w:r>
-        <w:t xml:space="preserve">Does the outrage you see online ever translate into action that actually changes anything? What is the relationship between online moral performance and real moral action?</w:t>
-      </w:r>
-    </w:p>
-    <w:p>
-      <w:pPr>
-        <w:numPr>
-          <w:ilvl w:val="0"/>
-          <w:numId w:val="1008"/>
-        </w:numPr>
-        <w:pStyle w:val="Compact"/>
-      </w:pPr>
-      <w:r>
-        <w:t xml:space="preserve">Justine Sacco's tweet was genuinely offensive. Was there a proportionate response available to the thousands of people who saw it, and what would it have looked like?</w:t>
+        <w:t xml:space="preserve">Justine Sacco's tweet was genuinely offensive. Was a proportionate response available to the thousands who saw it, and what would it have looked like?</w:t>
       </w:r>
     </w:p>
     <w:bookmarkEnd w:id="51"/>
@@ -3294,7 +3238,7 @@
         <w:pStyle w:val="FirstParagraph"/>
       </w:pPr>
       <w:r>
-        <w:t xml:space="preserve">Beyond specific intellectual and moral virtues, the deepest Aristotelian concern is about the shape of a complete human life. Eudaimonia requires more than isolated virtuous acts — it requires the integrated exercise of our highest capacities across time, in the context of genuine relationships, purposeful activity, and honest self-knowledge. Contemporary evidence suggests that social media and AI may be fragmenting attention, commodifying relationships, and distorting self-understanding in ways that threaten the conditions necessary for a genuinely flourishing life.</w:t>
+        <w:t xml:space="preserve">Beyond specific virtues, the deepest Aristotelian concern is the shape of a complete life. Eudaimonia requires the integrated exercise of our highest capacities across time, amid genuine relationships, purposeful activity, and honest self-knowledge. Social media and AI may fragment attention, commodify relationships, and distort self-understanding in ways that threaten those conditions.</w:t>
       </w:r>
     </w:p>
     <w:p>
@@ -3399,7 +3343,7 @@
         <w:t xml:space="preserve"> </w:t>
       </w:r>
       <w:r>
-        <w:t xml:space="preserve">that rates of depression, anxiety, and self-harm among American teenagers — particularly girls — began climbing sharply around that year, which is close to the point at which smartphones became the majority technology among American teens. He proposes several mechanisms. Social media enables social comparison at a scale previously impossible: teenagers can monitor hundreds of peers' curated self-presentations at once, receiving continuous feedback about their relative standing. Add the displacement of sleep by phones in bedrooms and of face-to-face time by screen time, and you have, on his account, conditions particularly corrosive for developing minds.</w:t>
+        <w:t xml:space="preserve">that depression, anxiety, and self-harm among American teenagers — particularly girls — began climbing sharply around that year, close to the point at which smartphones became the majority technology among American teens. Social media, he proposes, enables comparison at a previously impossible scale; add phones displacing sleep and screens displacing face-to-face time, and the conditions are particularly corrosive for developing minds.</w:t>
       </w:r>
     </w:p>
     <w:p>
@@ -3407,7 +3351,7 @@
         <w:pStyle w:val="BodyText"/>
       </w:pPr>
       <w:r>
-        <w:t xml:space="preserve">Public health authorities have taken the worry seriously without endorsing the causal claim. The 2023 advisory from the United States Surgeon General on social media and youth mental health concluded that the evidence of harm was sufficient to justify precaution and insufficient to establish that social media is safe — which is not the same thing as concluding that it is the cause</w:t>
+        <w:t xml:space="preserve">Public health authorities have taken the worry seriously without endorsing the causal claim. The 2023 United States Surgeon General's advisory concluded that the evidence of harm justified precaution but was insufficient to establish that social media is safe — not the same as concluding it is the cause</w:t>
       </w:r>
       <w:r>
         <w:t xml:space="preserve"> </w:t>
@@ -3416,7 +3360,7 @@
         <w:t xml:space="preserve">(Murthy, 2023)</w:t>
       </w:r>
       <w:r>
-        <w:t xml:space="preserve">. This is the single most contested empirical claim in the chapter, and it would be dishonest to present it as settled. A chapter organized around the intellectual virtues has to model what it recommends, which means laying out the strongest version of the case against.</w:t>
+        <w:t xml:space="preserve">. This is the chapter's most contested claim, so it deserves the strongest case against.</w:t>
       </w:r>
     </w:p>
     <w:p>
@@ -3432,7 +3376,7 @@
         <w:pStyle w:val="Objection"/>
       </w:pPr>
       <w:r>
-        <w:t xml:space="preserve">Critics including the developmental psychologist Candice Odgers and the researchers Amy Orben and Andrew Przybylski argue that the causal claim outruns the evidence. Nearly all of the underlying studies are correlational, and the correlations are small: in one large-dataset reanalysis, the association between digital technology use and adolescent well-being was comparable in size to associations with things like wearing glasses or eating potatoes</w:t>
+        <w:t xml:space="preserve">Critics including the developmental psychologist Candice Odgers and the researchers Amy Orben and Andrew Przybylski argue that the causal claim outruns the evidence. Nearly all the underlying studies are correlational, and the correlations are small: in one large reanalysis the association between digital technology use and adolescent well-being was comparable to that of wearing glasses or eating potatoes</w:t>
       </w:r>
       <w:r>
         <w:t xml:space="preserve"> </w:t>
@@ -3441,23 +3385,7 @@
         <w:t xml:space="preserve">(Orben &amp; Przybylski, 2019)</w:t>
       </w:r>
       <w:r>
-        <w:t xml:space="preserve">. Reverse causation is at least as plausible as the causal story — struggling teenagers may turn to their phones rather than being made to struggle by them. The post-2012 rise also has rival explanations that the smartphone hypothesis has to beat rather than assume away: changing diagnostic and screening practice, reduced stigma around reporting, academic pressure, and economic insecurity. Odgers's review of</w:t>
-      </w:r>
-      <w:r>
-        <w:t xml:space="preserve"> </w:t>
-      </w:r>
-      <w:r>
-        <w:rPr>
-          <w:iCs/>
-          <w:i/>
-        </w:rPr>
-        <w:t xml:space="preserve">The Anxious Generation</w:t>
-      </w:r>
-      <w:r>
-        <w:t xml:space="preserve"> </w:t>
-      </w:r>
-      <w:r>
-        <w:t xml:space="preserve">in</w:t>
+        <w:t xml:space="preserve">. Reverse causation is at least as plausible — struggling teenagers may turn to their phones rather than being made to struggle by them. Rival explanations for the post-2012 rise must be beaten, not assumed away: changing diagnostic practice, reduced stigma, academic pressure, economic insecurity. Odgers's</w:t>
       </w:r>
       <w:r>
         <w:t xml:space="preserve"> </w:t>
@@ -3473,7 +3401,7 @@
         <w:t xml:space="preserve"> </w:t>
       </w:r>
       <w:r>
-        <w:t xml:space="preserve">puts the objection bluntly: the book tells a compelling story, but the science does not yet support the conclusion that social media is rewiring childhood</w:t>
+        <w:t xml:space="preserve">review puts it bluntly: the book tells a compelling story, but the science does not yet support the conclusion that social media is rewiring childhood</w:t>
       </w:r>
       <w:r>
         <w:t xml:space="preserve"> </w:t>
@@ -3490,7 +3418,7 @@
         <w:pStyle w:val="BodyText"/>
       </w:pPr>
       <w:r>
-        <w:t xml:space="preserve">Haidt's reply is that the skeptics are looking at the wrong evidence. Correlational studies of average daily use will find small effects, he argues, because the harm is concentrated and the measure is crude; the better evidence comes from experiments in which users deactivate their accounts, and from the fact that the same inflection appears in the same years across many countries at once. Critics respond that deactivation experiments are short, small, and inconsistent, and that international synchrony is exactly what you would expect from any globally shared event</w:t>
+        <w:t xml:space="preserve">Haidt's reply is that the skeptics look at the wrong evidence: correlational studies of average daily use find small effects because the harm is concentrated and the measure crude, while deactivation experiments and the same inflection appearing across many countries tell a stronger story. Critics respond that deactivation experiments are short, small, and inconsistent, and that international synchrony is what any globally shared event would produce</w:t>
       </w:r>
       <w:r>
         <w:t xml:space="preserve"> </w:t>
@@ -3507,7 +3435,7 @@
         <w:pStyle w:val="BodyText"/>
       </w:pPr>
       <w:r>
-        <w:t xml:space="preserve">Where does that leave the virtue ethicist? In an uncomfortable but familiar position. Aristotle held that eudaimonia requires material and social conditions that support human development, so how well those conditions are being designed for young people is unavoidably an ethical question. But the answer depends partly on empirical facts that are currently disputed, and a chapter that quietly resolved the dispute in its own favor would be practicing the vice it warns against. The honest formulation is that the smartphone hypothesis is serious, live, and unproven, and should be held provisionally. What follows for policy when the evidence is genuinely uncertain is a question the next section takes up directly.</w:t>
+        <w:t xml:space="preserve">Where does that leave the virtue ethicist? Aristotle held that eudaimonia requires conditions supporting human development, so how those conditions are designed for the young is unavoidably an ethical question. But the answer depends on disputed facts, and a chapter that quietly resolved the dispute in its own favor would practice the vice it warns against. The smartphone hypothesis is serious, live, and unproven.</w:t>
       </w:r>
     </w:p>
     <w:bookmarkEnd w:id="54"/>
@@ -3525,12 +3453,6 @@
         <w:pStyle w:val="FirstParagraph"/>
       </w:pPr>
       <w:r>
-        <w:t xml:space="preserve">Turkle's book</w:t>
-      </w:r>
-      <w:r>
-        <w:t xml:space="preserve"> </w:t>
-      </w:r>
-      <w:r>
         <w:rPr>
           <w:iCs/>
           <w:i/>
@@ -3541,7 +3463,7 @@
         <w:t xml:space="preserve"> </w:t>
       </w:r>
       <w:r>
-        <w:t xml:space="preserve">captures a paradox at the heart of the social media age: we are more "connected" than any humans in history, yet loneliness is now widely treated as a public health problem rather than a private misfortune. The explanation lies in the difference between connection and genuine relationship. Social media friendship is typically measured by metrics — followers, likes, streaks, engagement rates — that have only an approximate relationship to the qualities that make friendship genuinely nourishing: shared vulnerability, mutual care, reciprocal knowledge of one another's inner lives.</w:t>
+        <w:t xml:space="preserve">captures a paradox: we are more "connected" than any humans in history, yet loneliness is now a public health problem. Social media friendship is measured by metrics — followers, likes, streaks — only loosely related to what makes friendship nourishing: shared vulnerability, mutual care, reciprocal knowledge of one another's inner lives.</w:t>
       </w:r>
     </w:p>
     <w:p>
@@ -3549,7 +3471,7 @@
         <w:pStyle w:val="BodyText"/>
       </w:pPr>
       <w:r>
-        <w:t xml:space="preserve">Dating apps extend this commodification to romantic relationships, subjecting potential partners to rapid evaluation and easy disposal in ways that may undermine the patience and sustained attention that deep intimacy requires.</w:t>
+        <w:t xml:space="preserve">Dating apps extend this to romance, subjecting partners to rapid evaluation and easy disposal in ways that may undermine the patience intimacy requires.</w:t>
       </w:r>
       <w:r>
         <w:t xml:space="preserve"> </w:t>
@@ -3565,7 +3487,7 @@
         <w:t xml:space="preserve"> </w:t>
       </w:r>
       <w:r>
-        <w:t xml:space="preserve">— the one-sided bonds that users form with social media influencers, podcasters, and increasingly AI companions — provide some of the emotional texture of relationship without its reciprocal demands. Turkle worries that we have come to "expect more from technology and less from each other"</w:t>
+        <w:t xml:space="preserve">— the one-sided bonds users form with influencers and increasingly AI companions — offer the texture of relationship without its reciprocal demands. Turkle worries that we have come to "expect more from technology and less from each other"</w:t>
       </w:r>
       <w:r>
         <w:t xml:space="preserve"> </w:t>
@@ -3574,10 +3496,7 @@
         <w:t xml:space="preserve">(Turkle, 2011)</w:t>
       </w:r>
       <w:r>
-        <w:t xml:space="preserve"> </w:t>
-      </w:r>
-      <w:r>
-        <w:t xml:space="preserve">— a substitution that may feel convenient in the short term but erodes our capacity for the genuine human connection on which eudaimonia depends.</w:t>
+        <w:t xml:space="preserve">, eroding our capacity for the connection eudaimonia depends on.</w:t>
       </w:r>
     </w:p>
     <w:bookmarkEnd w:id="55"/>
@@ -3595,7 +3514,7 @@
         <w:pStyle w:val="FirstParagraph"/>
       </w:pPr>
       <w:r>
-        <w:t xml:space="preserve">Aristotle placed self-knowledge — the honest, examined understanding of who one actually is — at the foundation of the ethical life. The ancient injunction "Know thyself" was for him not a platitude but a demanding practical requirement: genuine virtue requires that we perceive our own motivations clearly, recognize our tendencies toward excess and deficiency, and understand the gap between who we are and who we aspire to be. This kind of honest self-knowledge is threatened by a media environment in which our self-image is partly constructed by algorithms.</w:t>
+        <w:t xml:space="preserve">Aristotle placed self-knowledge at the foundation of the ethical life. "Know thyself" was for him a demanding requirement: virtue requires perceiving our own motivations clearly and understanding the gap between who we are and who we aspire to be. That self-knowledge is threatened when our self-image is partly constructed by algorithms.</w:t>
       </w:r>
     </w:p>
     <w:p>
@@ -3603,7 +3522,7 @@
         <w:pStyle w:val="BodyText"/>
       </w:pPr>
       <w:r>
-        <w:t xml:space="preserve">Recommendation algorithms learn what content you engage with and show you more of the same — they construct a mirror image of you built from your behavior patterns. But the algorithm's image of you reflects what captures your attention, not what you reflectively endorse, what you aspire to, or who you understand yourself to be. The loop between your behavior, the algorithm's model, the content it feeds you, and your subsequent behavior can lock people into identities they would not have chosen on reflection. It replaces the examined life — constantly interrogated and revised through experience and dialogue — with an algorithmically optimized product built from the residue of one's browsing history.</w:t>
+        <w:t xml:space="preserve">Recommendation algorithms build a mirror image of you from your behavior. But it reflects what captures your attention, not what you reflectively endorse. The loop between your behavior, the algorithm's model, and the content it feeds you can lock people into identities they would not have chosen — replacing the examined life with a product optimized from a browsing history.</w:t>
       </w:r>
     </w:p>
     <w:p>
@@ -3635,7 +3554,7 @@
         <w:pStyle w:val="Compact"/>
       </w:pPr>
       <w:r>
-        <w:t xml:space="preserve">Does your social media feed show you the world as you would choose to see it, or as an algorithm has decided you will pay attention to? What is the difference?</w:t>
+        <w:t xml:space="preserve">Have you ever felt that spending time on social media made you feel worse about your own life? What was the mechanism?</w:t>
       </w:r>
     </w:p>
     <w:p>
@@ -3647,19 +3566,7 @@
         <w:pStyle w:val="Compact"/>
       </w:pPr>
       <w:r>
-        <w:t xml:space="preserve">Have you ever felt that spending time on social media made you feel worse about your own life? What was the mechanism?</w:t>
-      </w:r>
-    </w:p>
-    <w:p>
-      <w:pPr>
-        <w:numPr>
-          <w:ilvl w:val="0"/>
-          <w:numId w:val="1010"/>
-        </w:numPr>
-        <w:pStyle w:val="Compact"/>
-      </w:pPr>
-      <w:r>
-        <w:t xml:space="preserve">Orben and Przybylski found that social media use predicts adolescent well-being about as strongly as wearing glasses does. Does that finding change your view, or do you think it is measuring the wrong thing?</w:t>
+        <w:t xml:space="preserve">Orben and Przybylski found that social media use predicts adolescent well-being about as strongly as wearing glasses does. Does that change your view, or is it measuring the wrong thing?</w:t>
       </w:r>
     </w:p>
     <w:bookmarkEnd w:id="56"/>
@@ -3680,7 +3587,7 @@
         <w:pStyle w:val="FirstParagraph"/>
       </w:pPr>
       <w:r>
-        <w:t xml:space="preserve">If the virtue ethics diagnosis is correct — if social media and AI are systematically habituating users toward intellectual and moral vice and undermining the conditions for flourishing — what follows practically? Two broad categories of response are available:</w:t>
+        <w:t xml:space="preserve">If the diagnosis is correct, what follows practically? Two categories of response are available:</w:t>
       </w:r>
       <w:r>
         <w:t xml:space="preserve"> </w:t>
@@ -3696,7 +3603,7 @@
         <w:t xml:space="preserve"> </w:t>
       </w:r>
       <w:r>
-        <w:t xml:space="preserve">responses that change personal habits and practices, and</w:t>
+        <w:t xml:space="preserve">responses that change personal habits, and</w:t>
       </w:r>
       <w:r>
         <w:t xml:space="preserve"> </w:t>
@@ -3712,7 +3619,7 @@
         <w:t xml:space="preserve"> </w:t>
       </w:r>
       <w:r>
-        <w:t xml:space="preserve">responses that address the design and regulation of technology at the systemic level. Virtue ethicists tend to see both as necessary, since individual willpower is limited and environmental design shapes what habits are even possible.</w:t>
+        <w:t xml:space="preserve">responses that address design and regulation. Virtue ethicists see both as necessary, since willpower is limited and environmental design shapes what habits are even possible.</w:t>
       </w:r>
     </w:p>
     <w:p>
@@ -3905,15 +3812,7 @@
         <w:pStyle w:val="BodyText"/>
       </w:pPr>
       <w:r>
-        <w:t xml:space="preserve">The bottom row is where the interesting arguments live. Individual responses are limited by the fact that willpower runs out and the platforms do not; structural responses are limited by the fact that they must survive both political objection and the practical problem of enforcement. The case study below is valuable precisely because it lets us watch a structural response run into that second limit in public.</w:t>
-      </w:r>
-    </w:p>
-    <w:p>
-      <w:pPr>
-        <w:pStyle w:val="BodyText"/>
-      </w:pPr>
-      <w:r>
-        <w:t xml:space="preserve">Vallor argues that individual responses — what she calls building a personal moral "operating system" for technology use — are essential but insufficient. Digital detoxes, attention training through meditation and deep reading, explicit commitments to face-to-face conversation, critical scrutiny of algorithmic recommendations: these are practices that can genuinely cultivate the virtues being eroded. But they require individuals to swim against a powerful current of commercial incentives and engineered addiction, which makes structural support necessary.</w:t>
+        <w:t xml:space="preserve">The bottom row is where the interesting arguments live. Individual responses are limited because willpower runs out and the platforms do not; structural responses must survive political objection and the problem of enforcement. Vallor calls the individual ones — digital detoxes, attention training, face-to-face commitments — essential but insufficient: they cultivate the eroded virtues, but require swimming against a powerful commercial current.</w:t>
       </w:r>
     </w:p>
     <w:bookmarkStart w:id="59" w:name="X9d10a359bc29780dc298f5d3dfe1ebd01d70e13"/>
@@ -3930,7 +3829,7 @@
         <w:pStyle w:val="FirstParagraph"/>
       </w:pPr>
       <w:r>
-        <w:t xml:space="preserve">Until recently, arguments about whether the state should restrict children's access to social media were conducted almost entirely in the hypothetical. That changed in December 2025, when Australia became the first country to put such a restriction into force nationwide. Enough time has now passed to ask the question that matters most for policy: what actually happened?</w:t>
+        <w:t xml:space="preserve">Until recently, arguments about restricting children's access to social media were entirely hypothetical. That changed in December 2025, when Australia became the first country to put such a restriction into force nationwide — letting us watch a structural response meet the enforcement problem in public.</w:t>
       </w:r>
     </w:p>
     <w:p>
@@ -3954,7 +3853,7 @@
         <w:pStyle w:val="CaseStudy"/>
       </w:pPr>
       <w:r>
-        <w:t xml:space="preserve">The Online Safety Amendment (Social Media Minimum Age) Act 2024 passed the Australian Parliament at the end of November 2024, received royal assent on 10 December 2024, and took effect on</w:t>
+        <w:t xml:space="preserve">The Online Safety Amendment (Social Media Minimum Age) Act 2024 took effect on</w:t>
       </w:r>
       <w:r>
         <w:t xml:space="preserve"> </w:t>
@@ -3973,7 +3872,7 @@
         <w:t xml:space="preserve">(Parliament of Australia, 2024)</w:t>
       </w:r>
       <w:r>
-        <w:t xml:space="preserve">. Its design detail matters: the legal duty falls entirely on</w:t>
+        <w:t xml:space="preserve">. The design matters: the legal duty falls on</w:t>
       </w:r>
       <w:r>
         <w:t xml:space="preserve"> </w:t>
@@ -3986,7 +3885,7 @@
         <w:t xml:space="preserve">platforms</w:t>
       </w:r>
       <w:r>
-        <w:t xml:space="preserve">, which must take "reasonable steps" to prevent under-16s from holding accounts. No penalty attaches to a child or a parent. Ten services are covered — Facebook, Instagram, Threads, Snapchat, TikTok, YouTube, X, Reddit, Kick, and Twitch — while WhatsApp, Messenger, Discord, Roblox, Steam, and Pinterest are not.</w:t>
+        <w:t xml:space="preserve">, which must take "reasonable steps" to prevent under-16s from holding accounts; no penalty attaches to a child or parent. Ten services are covered — Instagram, TikTok, YouTube, X, Reddit and others — but not WhatsApp, Discord, or Roblox.</w:t>
       </w:r>
     </w:p>
     <w:p>
@@ -3994,7 +3893,7 @@
         <w:pStyle w:val="CaseStudy"/>
       </w:pPr>
       <w:r>
-        <w:t xml:space="preserve">After roughly seven months, the results were mixed in an instructive way. Platforms removed or restricted more than</w:t>
+        <w:t xml:space="preserve">After seven months the results were instructively mixed. Platforms removed or restricted more than</w:t>
       </w:r>
       <w:r>
         <w:t xml:space="preserve"> </w:t>
@@ -4010,7 +3909,7 @@
         <w:t xml:space="preserve"> </w:t>
       </w:r>
       <w:r>
-        <w:t xml:space="preserve">under-16 accounts. Yet eSafety's longitudinal data showed under-16 usage falling only from</w:t>
+        <w:t xml:space="preserve">under-16 accounts, yet eSafety data showed usage falling only from</w:t>
       </w:r>
       <w:r>
         <w:t xml:space="preserve"> </w:t>
@@ -4029,7 +3928,7 @@
         <w:t xml:space="preserve">(eSafety Commissioner, 2026)</w:t>
       </w:r>
       <w:r>
-        <w:t xml:space="preserve">. A survey of 1,050 Australian 12- to 15-year-olds by the Molly Rose Foundation found that</w:t>
+        <w:t xml:space="preserve">. A Molly Rose Foundation survey of 1,050 Australian 12- to 15-year-olds found</w:t>
       </w:r>
       <w:r>
         <w:t xml:space="preserve"> </w:t>
@@ -4045,7 +3944,7 @@
         <w:t xml:space="preserve"> </w:t>
       </w:r>
       <w:r>
-        <w:t xml:space="preserve">of those who previously had accounts still had access to at least one,</w:t>
+        <w:t xml:space="preserve">of former account-holders still had access to at least one and</w:t>
       </w:r>
       <w:r>
         <w:t xml:space="preserve"> </w:t>
@@ -4061,7 +3960,16 @@
         <w:t xml:space="preserve"> </w:t>
       </w:r>
       <w:r>
-        <w:t xml:space="preserve">described getting around the ban as "easy," and</w:t>
+        <w:t xml:space="preserve">called getting around the ban "easy"</w:t>
+      </w:r>
+      <w:r>
+        <w:t xml:space="preserve"> </w:t>
+      </w:r>
+      <w:r>
+        <w:t xml:space="preserve">(Molly Rose Foundation, 2026)</w:t>
+      </w:r>
+      <w:r>
+        <w:t xml:space="preserve">. Only</w:t>
       </w:r>
       <w:r>
         <w:t xml:space="preserve"> </w:t>
@@ -4071,22 +3979,30 @@
           <w:bCs/>
           <w:b/>
         </w:rPr>
-        <w:t xml:space="preserve">51%</w:t>
-      </w:r>
-      <w:r>
-        <w:t xml:space="preserve"> </w:t>
-      </w:r>
-      <w:r>
-        <w:t xml:space="preserve">said it had made no difference to their safety</w:t>
-      </w:r>
-      <w:r>
-        <w:t xml:space="preserve"> </w:t>
-      </w:r>
-      <w:r>
-        <w:t xml:space="preserve">(Molly Rose Foundation, 2026)</w:t>
-      </w:r>
-      <w:r>
-        <w:t xml:space="preserve">. Crucially, only</w:t>
+        <w:t xml:space="preserve">4–5%</w:t>
+      </w:r>
+      <w:r>
+        <w:t xml:space="preserve"> </w:t>
+      </w:r>
+      <w:r>
+        <w:t xml:space="preserve">used a VPN: the workaround was social, not technical — a parent's ID, a friend's account, a false birth date.</w:t>
+      </w:r>
+    </w:p>
+    <w:p>
+      <w:pPr>
+        <w:pStyle w:val="CaseStudy"/>
+      </w:pPr>
+      <w:r>
+        <w:t xml:space="preserve">An April 2026 National Bureau of Economic Research paper co-authored by Cass Sunstein found fewer than one in three 14- and 15-year-olds complying at four months, and roughly one in twenty two months later</w:t>
+      </w:r>
+      <w:r>
+        <w:t xml:space="preserve"> </w:t>
+      </w:r>
+      <w:r>
+        <w:t xml:space="preserve">(Bursztyn et al., 2026)</w:t>
+      </w:r>
+      <w:r>
+        <w:t xml:space="preserve">. Teenagers reported needing about</w:t>
       </w:r>
       <w:r>
         <w:t xml:space="preserve"> </w:t>
@@ -4096,13 +4012,13 @@
           <w:bCs/>
           <w:b/>
         </w:rPr>
-        <w:t xml:space="preserve">4–5%</w:t>
-      </w:r>
-      <w:r>
-        <w:t xml:space="preserve"> </w:t>
-      </w:r>
-      <w:r>
-        <w:t xml:space="preserve">used a VPN: the workaround was social, not technical — a parent's ID, a login that was never signed out, a friend's account, a false birth date.</w:t>
+        <w:t xml:space="preserve">two of every three peers</w:t>
+      </w:r>
+      <w:r>
+        <w:t xml:space="preserve"> </w:t>
+      </w:r>
+      <w:r>
+        <w:t xml:space="preserve">to comply before they would — a tipping point — and those who complied reported more boredom and more difficulty keeping up with friends.</w:t>
       </w:r>
     </w:p>
     <w:p>
@@ -4110,77 +4026,64 @@
         <w:pStyle w:val="CaseStudy"/>
       </w:pPr>
       <w:r>
-        <w:t xml:space="preserve">An April 2026 working paper from economists at the National Bureau of Economic Research, including Cass Sunstein, found fewer than one in three 14- and 15-year-olds complying at four months, and roughly one in twenty two months later</w:t>
-      </w:r>
-      <w:r>
-        <w:t xml:space="preserve"> </w:t>
-      </w:r>
-      <w:r>
-        <w:t xml:space="preserve">(Bursztyn et al., 2026)</w:t>
-      </w:r>
-      <w:r>
-        <w:t xml:space="preserve">. Teenagers reported needing about</w:t>
-      </w:r>
-      <w:r>
-        <w:t xml:space="preserve"> </w:t>
-      </w:r>
+        <w:t xml:space="preserve">Enforcement stayed quiet: no fines as of July 2026, though investigations into five major platforms opened in March, and no clear decline in cyberbullying or image-abuse complaints. Public support among Australian adults nonetheless</w:t>
+      </w:r>
+      <w:r>
+        <w:t xml:space="preserve"> </w:t>
+      </w:r>
+      <w:r>
+        <w:rPr>
+          <w:iCs/>
+          <w:i/>
+        </w:rPr>
+        <w:t xml:space="preserve">rose</w:t>
+      </w:r>
+      <w:r>
+        <w:t xml:space="preserve">.</w:t>
+      </w:r>
+    </w:p>
+    <w:p>
+      <w:pPr>
+        <w:pStyle w:val="BodyText"/>
+      </w:pPr>
+      <w:r>
+        <w:t xml:space="preserve">Read as a natural experiment, the case is more interesting than either side's talking points. It did not fail: a four-point drop in a behavior this entrenched is real. Nor did it do what it promised: four in five under-16s are still on social media, most who left could return tomorrow, and nobody has been fined. Three ethical questions follow.</w:t>
+      </w:r>
+    </w:p>
+    <w:p>
+      <w:pPr>
+        <w:pStyle w:val="BodyText"/>
+      </w:pPr>
       <w:r>
         <w:rPr>
           <w:bCs/>
           <w:b/>
         </w:rPr>
-        <w:t xml:space="preserve">two of every three peers</w:t>
-      </w:r>
-      <w:r>
-        <w:t xml:space="preserve"> </w:t>
-      </w:r>
-      <w:r>
-        <w:t xml:space="preserve">to comply before they would — the classic structure of a tipping point. Those who did comply reported more boredom and more difficulty keeping up with their friends.</w:t>
-      </w:r>
-    </w:p>
-    <w:p>
-      <w:pPr>
-        <w:pStyle w:val="CaseStudy"/>
-      </w:pPr>
-      <w:r>
-        <w:t xml:space="preserve">Meanwhile the enforcement side stayed quiet. No fines had been issued as of July 2026, though formal investigations opened in March 2026 into Facebook, Instagram, Snapchat, TikTok, and YouTube, and in June 2026 the government moved to double the maximum penalty from A$49.5 million to A$99 million. There was no clear decline in cyberbullying or image-abuse complaints. Two High Court challenges — brought by the Digital Freedom Project and by Reddit — argue that the Act infringes the implied freedom of political communication; neither has been decided. And yet public support</w:t>
-      </w:r>
-      <w:r>
-        <w:t xml:space="preserve"> </w:t>
-      </w:r>
-      <w:r>
-        <w:rPr>
-          <w:iCs/>
-          <w:i/>
-        </w:rPr>
-        <w:t xml:space="preserve">rose</w:t>
-      </w:r>
-      <w:r>
-        <w:t xml:space="preserve">, to roughly</w:t>
-      </w:r>
-      <w:r>
-        <w:t xml:space="preserve"> </w:t>
-      </w:r>
+        <w:t xml:space="preserve">First: does a law count as working if it is popular but unenforced?</w:t>
+      </w:r>
+      <w:r>
+        <w:t xml:space="preserve"> </w:t>
+      </w:r>
+      <w:r>
+        <w:t xml:space="preserve">On one view an unenforced law is theatre — a government claims to have acted while the harm continues, and young people learn that rules are things you route around. On another, legislation expresses a public norm, and norms shift slowly. The two-thirds tipping point suggests a law's real work may be to move a population toward that threshold rather than to punish individuals, in which case seven months is far too early to score it. Aristotle, who thought law's function was to habituate rather than punish, would have preferred this reading — though a law nobody obeys habituates nobody.</w:t>
+      </w:r>
+    </w:p>
+    <w:p>
+      <w:pPr>
+        <w:pStyle w:val="BodyText"/>
+      </w:pPr>
       <w:r>
         <w:rPr>
           <w:bCs/>
           <w:b/>
         </w:rPr>
-        <w:t xml:space="preserve">77–79%</w:t>
-      </w:r>
-      <w:r>
-        <w:t xml:space="preserve"> </w:t>
-      </w:r>
-      <w:r>
-        <w:t xml:space="preserve">of Australian adults, with a sharp generational split (72% of 18–24-year-olds against 87% of those over 65) and only about 38% of Australian children in favor. Malaysia, the United Kingdom, Indonesia, Denmark, and New Zealand have all moved to copy the policy.</w:t>
-      </w:r>
-    </w:p>
-    <w:p>
-      <w:pPr>
-        <w:pStyle w:val="BodyText"/>
-      </w:pPr>
-      <w:r>
-        <w:t xml:space="preserve">Read as a natural experiment, the Australian case is more interesting than either side's talking points. It did not fail: five million accounts is not nothing, and a four-point drop in a behavior this entrenched is a real effect. It also did not do what it promised: four in five under-16s are still on social media, most of the ones who left could return tomorrow, and nobody has been fined. Three ethical questions follow, and none of them has an obvious answer.</w:t>
+        <w:t xml:space="preserve">Second: is it fair that partial compliance mainly costs the students who obeyed?</w:t>
+      </w:r>
+      <w:r>
+        <w:t xml:space="preserve"> </w:t>
+      </w:r>
+      <w:r>
+        <w:t xml:space="preserve">The teenagers who followed the rule reported more boredom and more difficulty keeping up with friends — because their friends had not. Where a restriction's benefit depends on nearly everyone accepting it, partial compliance delivers not a partial benefit but a pure cost, landing on the children who did what was asked — perverse habituation, giving compliant children practice at being penalized for compliance.</w:t>
       </w:r>
     </w:p>
     <w:p>
@@ -4192,42 +4095,6 @@
           <w:bCs/>
           <w:b/>
         </w:rPr>
-        <w:t xml:space="preserve">First: does a law count as working if it is popular but unenforced?</w:t>
-      </w:r>
-      <w:r>
-        <w:t xml:space="preserve"> </w:t>
-      </w:r>
-      <w:r>
-        <w:t xml:space="preserve">On one view, an unenforced law is theatre — it lets a government claim to have acted while the underlying harm continues, and it teaches young people that legal rules are things you route around. On another view, that misunderstands what laws do. Legislation is also an expression of a public norm, and norms shift slowly. The NBER finding that teenagers need about two-thirds of their peers to comply before they will comply themselves suggests that a law's real work may be to move a population toward a tipping point rather than to punish individuals. On that reading, seven months is far too early to score it, and rising public support is itself a form of success. Aristotle, who thought law's central function was to habituate citizens rather than merely to punish them, would have found this the more natural reading — though he would also have insisted that a law nobody obeys habituates nobody.</w:t>
-      </w:r>
-    </w:p>
-    <w:p>
-      <w:pPr>
-        <w:pStyle w:val="BodyText"/>
-      </w:pPr>
-      <w:r>
-        <w:rPr>
-          <w:bCs/>
-          <w:b/>
-        </w:rPr>
-        <w:t xml:space="preserve">Second: is it fair that partial compliance mainly costs the students who obeyed?</w:t>
-      </w:r>
-      <w:r>
-        <w:t xml:space="preserve"> </w:t>
-      </w:r>
-      <w:r>
-        <w:t xml:space="preserve">This is the sharpest finding in the whole dataset, and it should trouble anyone who supports the policy. The teenagers who followed the rule reported more boredom and more difficulty keeping up with friends — because their friends had not followed it. Where the benefit of a restriction depends on nearly everyone accepting it, partial compliance does not deliver a partial benefit; it can deliver a pure cost, and it lands on exactly the children who did what was asked. A virtue ethicist should notice how perverse the habituation is here: the policy gives compliant children practice at being penalized for compliance. Whether that is an argument for abandoning the law or for enforcing it much harder is genuinely contested.</w:t>
-      </w:r>
-    </w:p>
-    <w:p>
-      <w:pPr>
-        <w:pStyle w:val="BodyText"/>
-      </w:pPr>
-      <w:r>
-        <w:rPr>
-          <w:bCs/>
-          <w:b/>
-        </w:rPr>
         <w:t xml:space="preserve">Third: who bears the privacy cost of mandatory age assurance?</w:t>
       </w:r>
       <w:r>
@@ -4250,7 +4117,7 @@
         <w:t xml:space="preserve"> </w:t>
       </w:r>
       <w:r>
-        <w:t xml:space="preserve">is. In practice that means face-estimation software, document checks, or inferences drawn from behavioral data — applied to the entire adult population in order to exclude a minority of children. The cost of protecting children's flourishing is thus paid partly by adults, in a currency (identity data) that Chapter 6 will show is very difficult to keep contained once collected. Note that this cost falls hardest on people with the least documentation and the most reason to avoid identifying themselves. The Australian law tries to soften this: platforms may not collect government-issued identification for age assurance unless they also offer a reasonable alternative method. But no age-assurance technique is simultaneously accurate, cheap, and privacy-preserving, and pretending otherwise is the most common evasion in this debate.</w:t>
+        <w:t xml:space="preserve">is — face estimation, document checks, or behavioral inference, applied to the whole adult population to exclude a minority of children. The cost of protecting children's flourishing is thus paid partly by adults, in a currency (identity data) that Chapter 6 will show is hard to contain, and it falls hardest on those with the least documentation. The Australian law softens this — platforms may not require government identification without offering an alternative — but no age-assurance technique is at once accurate, cheap, and privacy-preserving.</w:t>
       </w:r>
     </w:p>
     <w:p>
@@ -4270,7 +4137,7 @@
         <w:pStyle w:val="Compact"/>
       </w:pPr>
       <w:r>
-        <w:t xml:space="preserve">Seven months in, Australian under-16 usage fell from 85.9% to 81.5%, and no platform has been fined. If you had to declare the law a success or a failure right now, which would you choose — and what evidence would change your mind?</w:t>
+        <w:t xml:space="preserve">Usage fell from 85.9% to 81.5% and no platform has been fined. If you had to call the law a success or a failure now, which — and what evidence would change your mind?</w:t>
       </w:r>
     </w:p>
     <w:p>
@@ -4282,7 +4149,7 @@
         <w:pStyle w:val="Compact"/>
       </w:pPr>
       <w:r>
-        <w:t xml:space="preserve">Public support for the ban rose to 77–79% among adults while only about 38% of Australian children supported it. Whose judgment should carry more weight on a policy about children's flourishing, and why?</w:t>
+        <w:t xml:space="preserve">Public support for the ban rose to 77–79% among adults while only about 38% of Australian children supported it. Whose judgment should carry more weight here, and why?</w:t>
       </w:r>
     </w:p>
     <w:p>
@@ -4294,19 +4161,7 @@
         <w:pStyle w:val="Compact"/>
       </w:pPr>
       <w:r>
-        <w:t xml:space="preserve">The children who complied reported more boredom and more social exclusion than those who did not. Does that make the law unjust, or does it make the case for enforcing it more strictly?</w:t>
-      </w:r>
-    </w:p>
-    <w:p>
-      <w:pPr>
-        <w:numPr>
-          <w:ilvl w:val="0"/>
-          <w:numId w:val="1011"/>
-        </w:numPr>
-        <w:pStyle w:val="Compact"/>
-      </w:pPr>
-      <w:r>
-        <w:t xml:space="preserve">Would you accept a face scan or an ID check every time you opened a social media app, if it reliably kept twelve-year-olds off the platform? What if it were only partly reliable?</w:t>
+        <w:t xml:space="preserve">The children who complied reported more boredom and social exclusion than those who did not. Does that make the law unjust, or make the case for enforcing it more strictly?</w:t>
       </w:r>
     </w:p>
     <w:bookmarkEnd w:id="59"/>
@@ -4340,7 +4195,7 @@
         <w:t xml:space="preserve"> </w:t>
       </w:r>
       <w:r>
-        <w:t xml:space="preserve">— requirements that platforms remove or redesign features shown to habituate users toward vice (infinite scroll, autoplay, manipulative notification systems);</w:t>
+        <w:t xml:space="preserve">removing features that habituate users toward vice (infinite scroll, autoplay, manipulative notifications);</w:t>
       </w:r>
       <w:r>
         <w:t xml:space="preserve"> </w:t>
@@ -4353,10 +4208,7 @@
         <w:t xml:space="preserve">algorithm transparency requirements</w:t>
       </w:r>
       <w:r>
-        <w:t xml:space="preserve"> </w:t>
-      </w:r>
-      <w:r>
-        <w:t xml:space="preserve">— giving users and regulators insight into what recommendation algorithms optimize for;</w:t>
+        <w:t xml:space="preserve">;</w:t>
       </w:r>
       <w:r>
         <w:t xml:space="preserve"> </w:t>
@@ -4369,10 +4221,7 @@
         <w:t xml:space="preserve">digital literacy education</w:t>
       </w:r>
       <w:r>
-        <w:t xml:space="preserve"> </w:t>
-      </w:r>
-      <w:r>
-        <w:t xml:space="preserve">— teaching young people to recognize the psychological techniques used to capture and hold their attention; and</w:t>
+        <w:t xml:space="preserve">; and</w:t>
       </w:r>
       <w:r>
         <w:t xml:space="preserve"> </w:t>
@@ -4385,10 +4234,7 @@
         <w:t xml:space="preserve">AI governance frameworks</w:t>
       </w:r>
       <w:r>
-        <w:t xml:space="preserve"> </w:t>
-      </w:r>
-      <w:r>
-        <w:t xml:space="preserve">— ensuring that AI systems preserve rather than replace authentic human engagement. The virtue ethics justification for all of these is similar: we are entitled to design our shared environment to be more conducive to human flourishing.</w:t>
+        <w:t xml:space="preserve">. The justification is the same for all: we are entitled to design our shared environment to be more conducive to flourishing.</w:t>
       </w:r>
     </w:p>
     <w:p>
@@ -4453,7 +4299,7 @@
         <w:pStyle w:val="FirstParagraph"/>
       </w:pPr>
       <w:r>
-        <w:t xml:space="preserve">The virtue ethics critique of technology is compelling, but it faces serious objections from multiple directions. Taking these objections seriously is itself an exercise in intellectual virtue.</w:t>
+        <w:t xml:space="preserve">The virtue ethics critique faces serious objections from several directions. Taking them seriously is itself an exercise in intellectual virtue.</w:t>
       </w:r>
     </w:p>
     <w:p>
@@ -4597,7 +4443,7 @@
         <w:t xml:space="preserve"> </w:t>
       </w:r>
       <w:r>
-        <w:t xml:space="preserve">insisted that "his own good, either physical or moral, is not a sufficient warrant" for coercing a competent adult — the harm principle, which licenses interference only to prevent harm to others. Isaiah Berlin's distinction between negative and positive liberty is one of the most important in twentieth-century political philosophy. Negative liberty is simply the absence of external interference — you are free if no one stops you from doing what you want. Positive liberty is the more demanding notion of being free</w:t>
+        <w:t xml:space="preserve">insisted that "his own good, either physical or moral, is not a sufficient warrant" for coercing a competent adult — the harm principle. Berlin's distinction is between negative liberty, the absence of interference, and positive liberty, being free</w:t>
       </w:r>
       <w:r>
         <w:t xml:space="preserve"> </w:t>
@@ -4613,7 +4459,7 @@
         <w:t xml:space="preserve"> </w:t>
       </w:r>
       <w:r>
-        <w:t xml:space="preserve">realize your genuine potential or pursue your true good. Berlin's concern, sharpened by bitter twentieth-century experience, was that appeals to positive liberty — to what people's "true" interests require — have historically been used to justify some of history's worst tyrannies. Telling people what their real flourishing consists in and arranging society to pursue it on their behalf is a pattern with a grim track record.</w:t>
+        <w:t xml:space="preserve">realize your genuine potential. His concern, sharpened by bitter twentieth-century experience, was that appeals to people's "true" interests have justified some of history's worst tyrannies.</w:t>
       </w:r>
     </w:p>
     <w:p>
@@ -4621,7 +4467,7 @@
         <w:pStyle w:val="BodyText"/>
       </w:pPr>
       <w:r>
-        <w:t xml:space="preserve">This objection is serious and should not be dismissed. Several responses are available, however. First, most virtue ethics policy proposals focus on</w:t>
+        <w:t xml:space="preserve">The objection is serious, but three responses are available. Most virtue ethics proposals focus on</w:t>
       </w:r>
       <w:r>
         <w:t xml:space="preserve"> </w:t>
@@ -4634,7 +4480,7 @@
         <w:t xml:space="preserve">children</w:t>
       </w:r>
       <w:r>
-        <w:t xml:space="preserve">, not adults — and it is much less controversial to say that protecting the moral development of those who have not yet achieved full autonomy is a legitimate state interest. Second, the relevant choice may not be between free markets and government intervention, but between two forms of manipulation: algorithmic manipulation by platforms optimizing for engagement, and structural design oriented toward human flourishing. If the current tech environment already involves systematic manipulation of "choice architecture," the question is not whether to design the environment but how. Third, some interventions — transparency requirements, design mandates, defaults rather than bans — are "soft" in Berlin's sense: they change the environment of choice without eliminating options.</w:t>
+        <w:t xml:space="preserve">, and protecting the development of those without full autonomy is a far less controversial state interest. The relevant choice may not be between free markets and intervention but between two manipulations: platforms optimizing for engagement, and design oriented toward flourishing — if the environment already shapes "choice architecture," the question is not whether to design it but how. And some interventions, such as transparency requirements and defaults rather than bans, change the environment of choice without eliminating options.</w:t>
       </w:r>
     </w:p>
     <w:p>
@@ -4711,7 +4557,7 @@
         <w:pStyle w:val="FirstParagraph"/>
       </w:pPr>
       <w:r>
-        <w:t xml:space="preserve">Nietzsche's challenge to conventional morality is philosophically powerful. He argued that the virtues celebrated in ancient Greece — the virtues of the heroic aristocrat, the person of great ambition and self-assertion — were systematically suppressed in favor of what he called "slave morality": the praise of meekness, submission, and conformity that reflects the needs of those who cannot dominate but can form majorities. The virtue ethics critique of social media, in this light, might reflect the preferences of an intellectual class who value deep reading, face-to-face conversation, and sustained attention — a class whose cultural practices happen to be threatened by digital populism.</w:t>
+        <w:t xml:space="preserve">Nietzsche argued that the virtues of the heroic aristocrat — ambition and self-assertion — were suppressed in favor of "slave morality": the praise of meekness and conformity that suits those who cannot dominate but can form majorities. In this light, the critique of social media might reflect the preferences of an intellectual class whose own practices happen to be threatened by digital populism.</w:t>
       </w:r>
     </w:p>
     <w:p>
@@ -4719,7 +4565,7 @@
         <w:pStyle w:val="BodyText"/>
       </w:pPr>
       <w:r>
-        <w:t xml:space="preserve">The Aristotelian response would be to appeal not to cultural consensus but to human nature: some character traits are genuinely better for human beings because they are more fully expressive of our rational and social nature. Intellectual humility, honest self-examination, and empathic engagement with others are not mere cultural preferences — they are constitutive of the kind of creature we are. Whether this response is fully satisfying is a question philosophers continue to debate. But it is worth noting that Nietzsche's "higher man" — the person who self-consciously transcends conventional morality — presumably also requires the intellectual virtues of honesty and self-examination that the critique aims to protect. Even on Nietzschean terms, technologies that systematically cultivate self-deception, intellectual passivity, and social comparison anxiety seem unlikely to be routes to genuine excellence.</w:t>
+        <w:t xml:space="preserve">The Aristotelian response appeals not to cultural consensus but to human nature: some traits are better for us because they more fully express our rational and social nature. Whether that satisfies is still debated. But Nietzsche's "higher man" presumably also needs the honesty and self-examination the critique protects, so even on Nietzschean terms, technologies cultivating self-deception, passivity, and comparison anxiety seem unlikely routes to excellence.</w:t>
       </w:r>
     </w:p>
     <w:p>
@@ -4740,7 +4586,7 @@
         <w:t xml:space="preserve">empirical</w:t>
       </w:r>
       <w:r>
-        <w:t xml:space="preserve">, and this chapter has already conceded much of it. As the section on eudaimonia showed, the evidence that social media causes the harms attributed to it is genuinely contested: the correlations are small, reverse causation is live, and rival explanations for the post-2012 rise have not been ruled out. Virtue ethics claims about technology's effects on character are in part empirical claims, and intellectual virtue requires treating them as such. What that concession does</w:t>
+        <w:t xml:space="preserve">, and this chapter has already conceded much of it: the correlations are small, reverse causation is live, and rival explanations for the post-2012 rise have not been ruled out. What that does</w:t>
       </w:r>
       <w:r>
         <w:t xml:space="preserve"> </w:t>
@@ -4756,7 +4602,7 @@
         <w:t xml:space="preserve"> </w:t>
       </w:r>
       <w:r>
-        <w:t xml:space="preserve">settle is what to do in the meantime. Australia decided to act on a disputed hypothesis and accept the cost of being wrong; other governments have decided to wait and accept a different cost. Neither is obviously the more rational response to uncertainty, and noticing that is more useful than pretending the evidence is stronger — or weaker — than it is.</w:t>
+        <w:t xml:space="preserve">settle is what to do meanwhile. Australia acted on a disputed hypothesis and accepted the cost of being wrong; other governments waited and accepted a different cost. Neither is obviously the more rational response to uncertainty, and noticing that is more useful than pretending the evidence is stronger or weaker than it is.</w:t>
       </w:r>
     </w:p>
     <w:p>
@@ -4788,7 +4634,7 @@
         <w:pStyle w:val="Compact"/>
       </w:pPr>
       <w:r>
-        <w:t xml:space="preserve">Could the virtue ethics critique of social media reflect the cultural preferences of a particular class of intellectuals rather than universal human goods?</w:t>
+        <w:t xml:space="preserve">If the evidence of harm is genuinely uncertain, does the burden of proof fall on those who want to regulate or on those who want to leave things alone?</w:t>
       </w:r>
     </w:p>
     <w:p>
@@ -4800,19 +4646,7 @@
         <w:pStyle w:val="Compact"/>
       </w:pPr>
       <w:r>
-        <w:t xml:space="preserve">If the evidence that social media causes mental health harms is genuinely uncertain, how should policymakers respond — and does the burden of proof fall on those who want to regulate or on those who want to leave things alone?</w:t>
-      </w:r>
-    </w:p>
-    <w:p>
-      <w:pPr>
-        <w:numPr>
-          <w:ilvl w:val="0"/>
-          <w:numId w:val="1015"/>
-        </w:numPr>
-        <w:pStyle w:val="Compact"/>
-      </w:pPr>
-      <w:r>
-        <w:t xml:space="preserve">Mill would allow the state to interfere only to prevent harm to others. Can the case against engagement-optimized platforms be made entirely in terms of harm to others, without appealing to anyone's flourishing?</w:t>
+        <w:t xml:space="preserve">Mill would allow interference only to prevent harm to others. Can the case against engagement-optimized platforms be made entirely in those terms, without appealing to flourishing?</w:t>
       </w:r>
     </w:p>
     <w:bookmarkEnd w:id="63"/>
@@ -4868,7 +4702,7 @@
         <w:t xml:space="preserve"> </w:t>
       </w:r>
       <w:r>
-        <w:t xml:space="preserve">argued that virtues are stable character traits developed through practice and habituation; the environment in which we practice shapes the character we acquire.</w:t>
+        <w:t xml:space="preserve">argued that virtues are stable traits developed through practice, so the environment in which we practice shapes the character we acquire.</w:t>
       </w:r>
     </w:p>
     <w:p>
@@ -4890,7 +4724,7 @@
         <w:t xml:space="preserve"> </w:t>
       </w:r>
       <w:r>
-        <w:t xml:space="preserve">(flourishing) is not pleasure or life satisfaction — it is the active exercise of our highest capacities across a complete life, requiring virtue, meaningful relationships, and honest self-knowledge.</w:t>
+        <w:t xml:space="preserve">is not pleasure or life satisfaction but the active exercise of our highest capacities across a complete life.</w:t>
       </w:r>
     </w:p>
     <w:p>
@@ -4912,7 +4746,7 @@
         <w:t xml:space="preserve"> </w:t>
       </w:r>
       <w:r>
-        <w:t xml:space="preserve">(curiosity, open-mindedness, intellectual humility) may be undermined by the attention crisis, cognitive offloading, echo chambers, and AI dependency produced by current digital technologies.</w:t>
+        <w:t xml:space="preserve">may be undermined by the attention crisis, cognitive offloading, echo chambers, and AI dependency.</w:t>
       </w:r>
     </w:p>
     <w:p>
@@ -4934,7 +4768,7 @@
         <w:t xml:space="preserve"> </w:t>
       </w:r>
       <w:r>
-        <w:t xml:space="preserve">(empathy, patience, civility, honesty) may be eroded when digital mediation replaces face-to-face practice, online disinhibition normalizes cruelty, and outrage-optimizing algorithms reward moral performance over moral action.</w:t>
+        <w:t xml:space="preserve">may be eroded when digital mediation replaces face-to-face practice, disinhibition normalizes cruelty, and outrage-optimizing algorithms reward performance over action.</w:t>
       </w:r>
     </w:p>
     <w:p>
@@ -4950,13 +4784,13 @@
           <w:bCs/>
           <w:b/>
         </w:rPr>
-        <w:t xml:space="preserve">The causal evidence is contested.</w:t>
-      </w:r>
-      <w:r>
-        <w:t xml:space="preserve"> </w:t>
-      </w:r>
-      <w:r>
-        <w:t xml:space="preserve">Haidt's smartphone hypothesis about the post-2012 rise in adolescent distress is opposed by Odgers, Orben, and Przybylski, who find the correlations small and the causal question open — the hypothesis should be held seriously but provisionally.</w:t>
+        <w:t xml:space="preserve">The causal evidence is contested:</w:t>
+      </w:r>
+      <w:r>
+        <w:t xml:space="preserve"> </w:t>
+      </w:r>
+      <w:r>
+        <w:t xml:space="preserve">Haidt's smartphone hypothesis about post-2012 adolescent distress is opposed by Odgers, Orben, and Przybylski, who find the correlations small and the causal question open — hold it seriously but provisionally.</w:t>
       </w:r>
     </w:p>
     <w:p>
@@ -4972,13 +4806,13 @@
           <w:bCs/>
           <w:b/>
         </w:rPr>
-        <w:t xml:space="preserve">Case study — Australia's under-16 ban</w:t>
-      </w:r>
-      <w:r>
-        <w:t xml:space="preserve"> </w:t>
-      </w:r>
-      <w:r>
-        <w:t xml:space="preserve">(in force 10 December 2025) shows what a structural intervention can and cannot do: 5 million+ accounts removed, but usage fell only from 85.9% to 81.5%, 61% of former account-holders retained access, no fines were issued — and public support still rose to 77–79%.</w:t>
+        <w:t xml:space="preserve">Australia's under-16 ban</w:t>
+      </w:r>
+      <w:r>
+        <w:t xml:space="preserve"> </w:t>
+      </w:r>
+      <w:r>
+        <w:t xml:space="preserve">(in force 10 December 2025) shows the limits of structural intervention: usage fell only from 85.9% to 81.5%, circumvention was social rather than technical, and no fines were issued.</w:t>
       </w:r>
     </w:p>
     <w:p>
@@ -4994,13 +4828,13 @@
           <w:bCs/>
           <w:b/>
         </w:rPr>
-        <w:t xml:space="preserve">Beware laundered statistics.</w:t>
-      </w:r>
-      <w:r>
-        <w:t xml:space="preserve"> </w:t>
-      </w:r>
-      <w:r>
-        <w:t xml:space="preserve">The "47 seconds" figure measures time on one screen before switching, not attention span; "we are what we repeatedly do" is Will Durant, not Aristotle. Checking attributions is itself an exercise of the intellectual virtues this chapter defends.</w:t>
+        <w:t xml:space="preserve">Beware laundered statistics:</w:t>
+      </w:r>
+      <w:r>
+        <w:t xml:space="preserve"> </w:t>
+      </w:r>
+      <w:r>
+        <w:t xml:space="preserve">the "47 seconds" figure measures time on one screen before switching, not attention span, and "we are what we repeatedly do" is Will Durant, not Aristotle.</w:t>
       </w:r>
     </w:p>
     <w:p>
@@ -5022,39 +4856,27 @@
         <w:t xml:space="preserve"> </w:t>
       </w:r>
       <w:r>
-        <w:t xml:space="preserve">applies Aristotelian virtue ethics to technology, arguing that our habitual digital practices cultivate either virtues or vices — and that intentional design for virtue cultivation is both possible and necessary.</w:t>
-      </w:r>
-    </w:p>
-    <w:p>
-      <w:pPr>
-        <w:numPr>
-          <w:ilvl w:val="0"/>
-          <w:numId w:val="1016"/>
-        </w:numPr>
-        <w:pStyle w:val="Compact"/>
-      </w:pPr>
+        <w:t xml:space="preserve">argues that habitual digital practices cultivate either virtues or vices, so design for virtue is possible and necessary — against which</w:t>
+      </w:r>
+      <w:r>
+        <w:t xml:space="preserve"> </w:t>
+      </w:r>
       <w:r>
         <w:rPr>
           <w:bCs/>
           <w:b/>
         </w:rPr>
-        <w:t xml:space="preserve">Isaiah Berlin's</w:t>
-      </w:r>
-      <w:r>
-        <w:t xml:space="preserve"> </w:t>
-      </w:r>
-      <w:r>
-        <w:t xml:space="preserve">distinction between negative liberty (freedom from interference) and positive liberty (freedom to flourish) poses the central challenge to virtue ethics regulation: appealing to people's "true" good has historically justified tyranny.</w:t>
-      </w:r>
-    </w:p>
-    <w:p>
-      <w:pPr>
-        <w:numPr>
-          <w:ilvl w:val="0"/>
-          <w:numId w:val="1016"/>
-        </w:numPr>
-        <w:pStyle w:val="Compact"/>
-      </w:pPr>
+        <w:t xml:space="preserve">Berlin's</w:t>
+      </w:r>
+      <w:r>
+        <w:t xml:space="preserve"> </w:t>
+      </w:r>
+      <w:r>
+        <w:t xml:space="preserve">negative liberty and</w:t>
+      </w:r>
+      <w:r>
+        <w:t xml:space="preserve"> </w:t>
+      </w:r>
       <w:r>
         <w:rPr>
           <w:bCs/>
@@ -5066,19 +4888,7 @@
         <w:t xml:space="preserve"> </w:t>
       </w:r>
       <w:r>
-        <w:t xml:space="preserve">challenge — who decides what counts as virtue? — demands that virtue ethicists ground their claims in something more than cultural consensus or class preference.</w:t>
-      </w:r>
-    </w:p>
-    <w:p>
-      <w:pPr>
-        <w:numPr>
-          <w:ilvl w:val="0"/>
-          <w:numId w:val="1016"/>
-        </w:numPr>
-        <w:pStyle w:val="Compact"/>
-      </w:pPr>
-      <w:r>
-        <w:t xml:space="preserve">Individual and structural responses to technology's moral harms are both necessary: personal practices building virtuous character, and social design creating environments more conducive to flourishing.</w:t>
+        <w:t xml:space="preserve">"who decides what counts as virtue?" remain the central challenges.</w:t>
       </w:r>
     </w:p>
     <w:bookmarkEnd w:id="65"/>

</xml_diff>